<commit_message>
Sweep 1/2 results: SOM rate and gGABA inhibition scans
</commit_message>
<xml_diff>
--- a/docs/Progress_Report.docx
+++ b/docs/Progress_Report.docx
@@ -3658,6 +3658,855 @@
         <w:t>Underneath all of this is the honest uncertainty this report tried not to smooth over: we don't yet have a single, reproducible number for Phase-1's headline gating ratio (Section 2.2's flag), and Step 2d just showed that the model's gating mechanism, as currently calibrated, depends on dendritic inhibition several times stronger than Yang's own math says it should need. Both of those are worth resolving before treating any specific ratio in this project as a stable, citable result.</w:t>
       </w:r>
     </w:p>
+    <w:p>
+      <w:pPr>
+        <w:pStyle w:val="Heading1"/>
+      </w:pPr>
+      <w:r>
+        <w:t>7. 2026-08-30 update — git safety, confirming the Phase 2 migration gap, and inhibition sweeps</w:t>
+      </w:r>
+    </w:p>
+    <w:p>
+      <w:r>
+        <w:rPr>
+          <w:b w:val="0"/>
+          <w:i w:val="0"/>
+        </w:rPr>
+        <w:t>Three follow-ups from Section 6's open items, done in order.</w:t>
+      </w:r>
+    </w:p>
+    <w:p>
+      <w:pPr>
+        <w:pStyle w:val="Heading2"/>
+      </w:pPr>
+      <w:r>
+        <w:t>7.1 A week of uncommitted work is now in git</w:t>
+      </w:r>
+    </w:p>
+    <w:p>
+      <w:r>
+        <w:rPr>
+          <w:b w:val="0"/>
+          <w:i w:val="0"/>
+        </w:rPr>
+        <w:t>Everything documented in Sections 3-6 above — the analytical plasticity implementation, the formula-comparison diagnostic, both Phase 2 sweeps, and this report itself — had been sitting as untracked or modified files since 2026-08-26/27, never committed. It is now: commit 212505b, 36 files changed (3247 insertions).</w:t>
+      </w:r>
+    </w:p>
+    <w:p>
+      <w:pPr>
+        <w:pStyle w:val="Heading2"/>
+      </w:pPr>
+      <w:r>
+        <w:t>7.2 Confirming the Phase 2 migration gap directly</w:t>
+      </w:r>
+    </w:p>
+    <w:p>
+      <w:r>
+        <w:rPr>
+          <w:b w:val="0"/>
+          <w:i w:val="0"/>
+        </w:rPr>
+        <w:t>Section 5.3 already flagged, by inference, that `full_circuit.py` and the two Phase 2 scripts were not migrated to the analytical plasticity update and that Section 3's figures might therefore be stale. We checked this directly rather than leaving it as an inference.</w:t>
+      </w:r>
+    </w:p>
+    <w:p>
+      <w:r>
+        <w:rPr>
+          <w:b/>
+          <w:color w:val="B00000"/>
+        </w:rPr>
+        <w:t xml:space="preserve">Flag: </w:t>
+      </w:r>
+      <w:r>
+        <w:rPr>
+          <w:i/>
+        </w:rPr>
+        <w:t>Confirmed. File timestamps establish the order of events precisely: both Phase 2 figures (phase2_snr_curve.png, phase2_ketamine_failure.png) were generated on 2026-08-27 (00:54 and 00:33), and full_circuit.py was itself last edited 2026-08-27 03:05 — all before model/equations.py was edited on 2026-08-29 16:35 to comment out dρ/dt and declare `rho : 1` as a bare parameter (Section 5.3). Reading full_circuit.py's build_gating_circuit() directly confirms it does a single net.run(T) and reads sb0.rho/sb1.rho straight afterward, with no epoch loop and no call into src/v2/plasticity.py — the exact pattern that needs the epoch-update machinery experiments/phase1_analytical.py added. Consequence: rerunning phase2_snr_breakdown.py or phase2_schizophrenia_sim.py today, unmodified, would hold rho frozen at its initialized 0.5 on both branches for the entire run, at every noise_level / md2vip_scale / seed combination — ratio identically 1.0, not just numerically close to it. The existing figures (ratio ~62 at zero noise, branch-0 rho falling to ~0.01-0.02 under full MD-&gt;VIP block) sit in the same range as the old 346x-bugged ODE's dynamics (Section 4.3), not the new analytical update's honest ~2.81 ceiling (Section 5.4) — consistent with having been generated before the bug was even fixed, let alone before the switch to the analytical update. Both Phase 2 figures must be treated as retired until full_circuit.py is migrated to the same epoch-loop + yang_synapse_update pattern as experiments/phase1_analytical.py and both sweeps are rerun.</w:t>
+      </w:r>
+    </w:p>
+    <w:p>
+      <w:r>
+        <w:rPr>
+          <w:b w:val="0"/>
+          <w:i w:val="0"/>
+        </w:rPr>
+        <w:t>docs/gamma_tau_analysis.md was also updated with one sentence confirming that its opening question (Section 4.3's gamma/tau timescale question — does canonical Graupner-Brunel gate given enough time?) is superseded by the switch to the analytical epoch-based update, which does not depend on simulation duration for convergence.</w:t>
+      </w:r>
+    </w:p>
+    <w:p>
+      <w:pPr>
+        <w:pStyle w:val="Heading2"/>
+      </w:pPr>
+      <w:r>
+        <w:t>7.3 SOM-rate and gGABA inhibition sweeps</w:t>
+      </w:r>
+    </w:p>
+    <w:p>
+      <w:r>
+        <w:rPr>
+          <w:b w:val="0"/>
+          <w:i w:val="0"/>
+        </w:rPr>
+        <w:t>Step 2d (Section 5.5) left three options on the table for reconciling Yang's ~10 Hz SOM rate with this model's need for far more dendritic shunting to gate. Rather than pick one blind, we ran two sweeps, each the full 15-epoch analytical protocol per point (three points reused from prior runs, described inline).</w:t>
+      </w:r>
+    </w:p>
+    <w:p>
+      <w:pPr>
+        <w:pStyle w:val="Heading3"/>
+      </w:pPr>
+      <w:r>
+        <w:t>Sweep 1 — SOM rate, gGABA held at Yang-matched 40 nS total</w:t>
+      </w:r>
+    </w:p>
+    <w:tbl>
+      <w:tblPr>
+        <w:tblStyle w:val="LightGrid-Accent1"/>
+        <w:tblW w:type="auto" w:w="0"/>
+        <w:tblLook w:firstColumn="1" w:firstRow="1" w:lastColumn="0" w:lastRow="0" w:noHBand="0" w:noVBand="1" w:val="04A0"/>
+      </w:tblPr>
+      <w:tblGrid>
+        <w:gridCol w:w="785"/>
+        <w:gridCol w:w="785"/>
+        <w:gridCol w:w="785"/>
+        <w:gridCol w:w="785"/>
+        <w:gridCol w:w="785"/>
+        <w:gridCol w:w="785"/>
+        <w:gridCol w:w="785"/>
+        <w:gridCol w:w="785"/>
+        <w:gridCol w:w="785"/>
+        <w:gridCol w:w="785"/>
+        <w:gridCol w:w="785"/>
+      </w:tblGrid>
+      <w:tr>
+        <w:tc>
+          <w:tcPr>
+            <w:tcW w:type="dxa" w:w="785"/>
+          </w:tcPr>
+          <w:p>
+            <w:r>
+              <w:rPr>
+                <w:b/>
+              </w:rPr>
+              <w:t>measured SOM rate (Hz)</w:t>
+            </w:r>
+          </w:p>
+        </w:tc>
+        <w:tc>
+          <w:tcPr>
+            <w:tcW w:type="dxa" w:w="785"/>
+          </w:tcPr>
+          <w:p>
+            <w:r>
+              <w:rPr>
+                <w:b/>
+              </w:rPr>
+              <w:t>10.14</w:t>
+            </w:r>
+          </w:p>
+        </w:tc>
+        <w:tc>
+          <w:tcPr>
+            <w:tcW w:type="dxa" w:w="785"/>
+          </w:tcPr>
+          <w:p>
+            <w:r>
+              <w:rPr>
+                <w:b/>
+              </w:rPr>
+              <w:t>16.87</w:t>
+            </w:r>
+          </w:p>
+        </w:tc>
+        <w:tc>
+          <w:tcPr>
+            <w:tcW w:type="dxa" w:w="785"/>
+          </w:tcPr>
+          <w:p>
+            <w:r>
+              <w:rPr>
+                <w:b/>
+              </w:rPr>
+              <w:t>21.49</w:t>
+            </w:r>
+          </w:p>
+        </w:tc>
+        <w:tc>
+          <w:tcPr>
+            <w:tcW w:type="dxa" w:w="785"/>
+          </w:tcPr>
+          <w:p>
+            <w:r>
+              <w:rPr>
+                <w:b/>
+              </w:rPr>
+              <w:t>25.29</w:t>
+            </w:r>
+          </w:p>
+        </w:tc>
+        <w:tc>
+          <w:tcPr>
+            <w:tcW w:type="dxa" w:w="785"/>
+          </w:tcPr>
+          <w:p>
+            <w:r>
+              <w:rPr>
+                <w:b/>
+              </w:rPr>
+              <w:t>28.80</w:t>
+            </w:r>
+          </w:p>
+        </w:tc>
+        <w:tc>
+          <w:tcPr>
+            <w:tcW w:type="dxa" w:w="785"/>
+          </w:tcPr>
+          <w:p>
+            <w:r>
+              <w:rPr>
+                <w:b/>
+              </w:rPr>
+              <w:t>33.09</w:t>
+            </w:r>
+          </w:p>
+        </w:tc>
+        <w:tc>
+          <w:tcPr>
+            <w:tcW w:type="dxa" w:w="785"/>
+          </w:tcPr>
+          <w:p>
+            <w:r>
+              <w:rPr>
+                <w:b/>
+              </w:rPr>
+              <w:t>39.04</w:t>
+            </w:r>
+          </w:p>
+        </w:tc>
+        <w:tc>
+          <w:tcPr>
+            <w:tcW w:type="dxa" w:w="785"/>
+          </w:tcPr>
+          <w:p>
+            <w:r>
+              <w:rPr>
+                <w:b/>
+              </w:rPr>
+              <w:t>46.49</w:t>
+            </w:r>
+          </w:p>
+        </w:tc>
+        <w:tc>
+          <w:tcPr>
+            <w:tcW w:type="dxa" w:w="785"/>
+          </w:tcPr>
+          <w:p>
+            <w:r>
+              <w:rPr>
+                <w:b/>
+              </w:rPr>
+              <w:t>55.22</w:t>
+            </w:r>
+          </w:p>
+        </w:tc>
+        <w:tc>
+          <w:tcPr>
+            <w:tcW w:type="dxa" w:w="785"/>
+          </w:tcPr>
+          <w:p>
+            <w:r>
+              <w:rPr>
+                <w:b/>
+              </w:rPr>
+              <w:t>63.30</w:t>
+            </w:r>
+          </w:p>
+        </w:tc>
+      </w:tr>
+      <w:tr>
+        <w:tc>
+          <w:tcPr>
+            <w:tcW w:type="dxa" w:w="785"/>
+          </w:tcPr>
+          <w:p>
+            <w:r>
+              <w:t>ratio (free/inhib)</w:t>
+            </w:r>
+          </w:p>
+        </w:tc>
+        <w:tc>
+          <w:tcPr>
+            <w:tcW w:type="dxa" w:w="785"/>
+          </w:tcPr>
+          <w:p>
+            <w:r>
+              <w:t>1.02</w:t>
+            </w:r>
+          </w:p>
+        </w:tc>
+        <w:tc>
+          <w:tcPr>
+            <w:tcW w:type="dxa" w:w="785"/>
+          </w:tcPr>
+          <w:p>
+            <w:r>
+              <w:t>1.04</w:t>
+            </w:r>
+          </w:p>
+        </w:tc>
+        <w:tc>
+          <w:tcPr>
+            <w:tcW w:type="dxa" w:w="785"/>
+          </w:tcPr>
+          <w:p>
+            <w:r>
+              <w:t>5.51</w:t>
+            </w:r>
+          </w:p>
+        </w:tc>
+        <w:tc>
+          <w:tcPr>
+            <w:tcW w:type="dxa" w:w="785"/>
+          </w:tcPr>
+          <w:p>
+            <w:r>
+              <w:t>5.58</w:t>
+            </w:r>
+          </w:p>
+        </w:tc>
+        <w:tc>
+          <w:tcPr>
+            <w:tcW w:type="dxa" w:w="785"/>
+          </w:tcPr>
+          <w:p>
+            <w:r>
+              <w:t>4.95</w:t>
+            </w:r>
+          </w:p>
+        </w:tc>
+        <w:tc>
+          <w:tcPr>
+            <w:tcW w:type="dxa" w:w="785"/>
+          </w:tcPr>
+          <w:p>
+            <w:r>
+              <w:t>4.29</w:t>
+            </w:r>
+          </w:p>
+        </w:tc>
+        <w:tc>
+          <w:tcPr>
+            <w:tcW w:type="dxa" w:w="785"/>
+          </w:tcPr>
+          <w:p>
+            <w:r>
+              <w:t>3.63</w:t>
+            </w:r>
+          </w:p>
+        </w:tc>
+        <w:tc>
+          <w:tcPr>
+            <w:tcW w:type="dxa" w:w="785"/>
+          </w:tcPr>
+          <w:p>
+            <w:r>
+              <w:t>3.12</w:t>
+            </w:r>
+          </w:p>
+        </w:tc>
+        <w:tc>
+          <w:tcPr>
+            <w:tcW w:type="dxa" w:w="785"/>
+          </w:tcPr>
+          <w:p>
+            <w:r>
+              <w:t>2.91</w:t>
+            </w:r>
+          </w:p>
+        </w:tc>
+        <w:tc>
+          <w:tcPr>
+            <w:tcW w:type="dxa" w:w="785"/>
+          </w:tcPr>
+          <w:p>
+            <w:r>
+              <w:t>2.81</w:t>
+            </w:r>
+          </w:p>
+        </w:tc>
+      </w:tr>
+    </w:tbl>
+    <w:p/>
+    <w:p>
+      <w:pPr>
+        <w:jc w:val="center"/>
+      </w:pPr>
+      <w:r>
+        <w:drawing>
+          <wp:inline xmlns:a="http://schemas.openxmlformats.org/drawingml/2006/main" xmlns:pic="http://schemas.openxmlformats.org/drawingml/2006/picture">
+            <wp:extent cx="5486400" cy="2057400"/>
+            <wp:docPr id="11" name="Picture 11"/>
+            <wp:cNvGraphicFramePr>
+              <a:graphicFrameLocks noChangeAspect="1"/>
+            </wp:cNvGraphicFramePr>
+            <a:graphic>
+              <a:graphicData uri="http://schemas.openxmlformats.org/drawingml/2006/picture">
+                <pic:pic>
+                  <pic:nvPicPr>
+                    <pic:cNvPr id="0" name="som_rate_sweep.png"/>
+                    <pic:cNvPicPr/>
+                  </pic:nvPicPr>
+                  <pic:blipFill>
+                    <a:blip r:embed="rId19"/>
+                    <a:stretch>
+                      <a:fillRect/>
+                    </a:stretch>
+                  </pic:blipFill>
+                  <pic:spPr>
+                    <a:xfrm>
+                      <a:off x="0" y="0"/>
+                      <a:ext cx="5486400" cy="2057400"/>
+                    </a:xfrm>
+                    <a:prstGeom prst="rect"/>
+                  </pic:spPr>
+                </pic:pic>
+              </a:graphicData>
+            </a:graphic>
+          </wp:inline>
+        </w:drawing>
+      </w:r>
+    </w:p>
+    <w:p>
+      <w:pPr>
+        <w:jc w:val="center"/>
+      </w:pPr>
+      <w:r>
+        <w:rPr>
+          <w:i/>
+          <w:sz w:val="18"/>
+        </w:rPr>
+        <w:t>Figure 11. Sweep 1: gating ratio and final rho vs. measured SOM rate, gGABA held at the Yang-matched 40 nS total. The transition from fail to pass is a near step-function between 16.87 and 21.49 Hz, not a gradual climb.</w:t>
+      </w:r>
+    </w:p>
+    <w:p>
+      <w:r>
+        <w:rPr>
+          <w:b w:val="0"/>
+          <w:i w:val="0"/>
+        </w:rPr>
+        <w:t>The crossover is sharp, not gradual: ratio sits at ~1.0-1.04 for 10.14-16.87 Hz, then jumps to 5.51 at 21.49 Hz — a step, not a slope, consistent with the same near-threshold steepness noted in Section 4.2's SOM f-I curve. The minimum functional SOM rate for ratio &gt; 2 is therefore roughly 2x Yang's own ~10 Hz, not the far larger multiple the original 63 Hz-vs-10 Hz comparison (Section 5.5) implied. Past the crossover, ratio *declines* monotonically from a peak of 5.58 at 25.29 Hz back down to 2.81 at 63.3 Hz (the project's original working point) — more SOM drive past the crossover does not mean more gating; it means less, though still comfortably above threshold.</w:t>
+      </w:r>
+    </w:p>
+    <w:p>
+      <w:pPr>
+        <w:pStyle w:val="Heading3"/>
+      </w:pPr>
+      <w:r>
+        <w:t>Sweep 2 — gGABA, SOM held at Yang's ~10.15 Hz</w:t>
+      </w:r>
+    </w:p>
+    <w:tbl>
+      <w:tblPr>
+        <w:tblStyle w:val="LightGrid-Accent1"/>
+        <w:tblW w:type="auto" w:w="0"/>
+        <w:tblLook w:firstColumn="1" w:firstRow="1" w:lastColumn="0" w:lastRow="0" w:noHBand="0" w:noVBand="1" w:val="04A0"/>
+      </w:tblPr>
+      <w:tblGrid>
+        <w:gridCol w:w="720"/>
+        <w:gridCol w:w="720"/>
+        <w:gridCol w:w="720"/>
+        <w:gridCol w:w="720"/>
+        <w:gridCol w:w="720"/>
+        <w:gridCol w:w="720"/>
+        <w:gridCol w:w="720"/>
+        <w:gridCol w:w="720"/>
+        <w:gridCol w:w="720"/>
+        <w:gridCol w:w="720"/>
+        <w:gridCol w:w="720"/>
+        <w:gridCol w:w="720"/>
+      </w:tblGrid>
+      <w:tr>
+        <w:tc>
+          <w:tcPr>
+            <w:tcW w:type="dxa" w:w="720"/>
+          </w:tcPr>
+          <w:p>
+            <w:r>
+              <w:rPr>
+                <w:b/>
+              </w:rPr>
+              <w:t>gGABA per synapse (nS)</w:t>
+            </w:r>
+          </w:p>
+        </w:tc>
+        <w:tc>
+          <w:tcPr>
+            <w:tcW w:type="dxa" w:w="720"/>
+          </w:tcPr>
+          <w:p>
+            <w:r>
+              <w:rPr>
+                <w:b/>
+              </w:rPr>
+              <w:t>4.0</w:t>
+            </w:r>
+          </w:p>
+        </w:tc>
+        <w:tc>
+          <w:tcPr>
+            <w:tcW w:type="dxa" w:w="720"/>
+          </w:tcPr>
+          <w:p>
+            <w:r>
+              <w:rPr>
+                <w:b/>
+              </w:rPr>
+              <w:t>6.0</w:t>
+            </w:r>
+          </w:p>
+        </w:tc>
+        <w:tc>
+          <w:tcPr>
+            <w:tcW w:type="dxa" w:w="720"/>
+          </w:tcPr>
+          <w:p>
+            <w:r>
+              <w:rPr>
+                <w:b/>
+              </w:rPr>
+              <w:t>8.0</w:t>
+            </w:r>
+          </w:p>
+        </w:tc>
+        <w:tc>
+          <w:tcPr>
+            <w:tcW w:type="dxa" w:w="720"/>
+          </w:tcPr>
+          <w:p>
+            <w:r>
+              <w:rPr>
+                <w:b/>
+              </w:rPr>
+              <w:t>10.0</w:t>
+            </w:r>
+          </w:p>
+        </w:tc>
+        <w:tc>
+          <w:tcPr>
+            <w:tcW w:type="dxa" w:w="720"/>
+          </w:tcPr>
+          <w:p>
+            <w:r>
+              <w:rPr>
+                <w:b/>
+              </w:rPr>
+              <w:t>12.0</w:t>
+            </w:r>
+          </w:p>
+        </w:tc>
+        <w:tc>
+          <w:tcPr>
+            <w:tcW w:type="dxa" w:w="720"/>
+          </w:tcPr>
+          <w:p>
+            <w:r>
+              <w:rPr>
+                <w:b/>
+              </w:rPr>
+              <w:t>14.0</w:t>
+            </w:r>
+          </w:p>
+        </w:tc>
+        <w:tc>
+          <w:tcPr>
+            <w:tcW w:type="dxa" w:w="720"/>
+          </w:tcPr>
+          <w:p>
+            <w:r>
+              <w:rPr>
+                <w:b/>
+              </w:rPr>
+              <w:t>16.0</w:t>
+            </w:r>
+          </w:p>
+        </w:tc>
+        <w:tc>
+          <w:tcPr>
+            <w:tcW w:type="dxa" w:w="720"/>
+          </w:tcPr>
+          <w:p>
+            <w:r>
+              <w:rPr>
+                <w:b/>
+              </w:rPr>
+              <w:t>18.0</w:t>
+            </w:r>
+          </w:p>
+        </w:tc>
+        <w:tc>
+          <w:tcPr>
+            <w:tcW w:type="dxa" w:w="720"/>
+          </w:tcPr>
+          <w:p>
+            <w:r>
+              <w:rPr>
+                <w:b/>
+              </w:rPr>
+              <w:t>20.0</w:t>
+            </w:r>
+          </w:p>
+        </w:tc>
+        <w:tc>
+          <w:tcPr>
+            <w:tcW w:type="dxa" w:w="720"/>
+          </w:tcPr>
+          <w:p>
+            <w:r>
+              <w:rPr>
+                <w:b/>
+              </w:rPr>
+              <w:t>22.0</w:t>
+            </w:r>
+          </w:p>
+        </w:tc>
+        <w:tc>
+          <w:tcPr>
+            <w:tcW w:type="dxa" w:w="720"/>
+          </w:tcPr>
+          <w:p>
+            <w:r>
+              <w:rPr>
+                <w:b/>
+              </w:rPr>
+              <w:t>24.0</w:t>
+            </w:r>
+          </w:p>
+        </w:tc>
+      </w:tr>
+      <w:tr>
+        <w:tc>
+          <w:tcPr>
+            <w:tcW w:type="dxa" w:w="720"/>
+          </w:tcPr>
+          <w:p>
+            <w:r>
+              <w:t>ratio (free/inhib)</w:t>
+            </w:r>
+          </w:p>
+        </w:tc>
+        <w:tc>
+          <w:tcPr>
+            <w:tcW w:type="dxa" w:w="720"/>
+          </w:tcPr>
+          <w:p>
+            <w:r>
+              <w:t>1.02</w:t>
+            </w:r>
+          </w:p>
+        </w:tc>
+        <w:tc>
+          <w:tcPr>
+            <w:tcW w:type="dxa" w:w="720"/>
+          </w:tcPr>
+          <w:p>
+            <w:r>
+              <w:t>1.04</w:t>
+            </w:r>
+          </w:p>
+        </w:tc>
+        <w:tc>
+          <w:tcPr>
+            <w:tcW w:type="dxa" w:w="720"/>
+          </w:tcPr>
+          <w:p>
+            <w:r>
+              <w:t>1.06</w:t>
+            </w:r>
+          </w:p>
+        </w:tc>
+        <w:tc>
+          <w:tcPr>
+            <w:tcW w:type="dxa" w:w="720"/>
+          </w:tcPr>
+          <w:p>
+            <w:r>
+              <w:t>1.11</w:t>
+            </w:r>
+          </w:p>
+        </w:tc>
+        <w:tc>
+          <w:tcPr>
+            <w:tcW w:type="dxa" w:w="720"/>
+          </w:tcPr>
+          <w:p>
+            <w:r>
+              <w:t>1.12</w:t>
+            </w:r>
+          </w:p>
+        </w:tc>
+        <w:tc>
+          <w:tcPr>
+            <w:tcW w:type="dxa" w:w="720"/>
+          </w:tcPr>
+          <w:p>
+            <w:r>
+              <w:t>1.15</w:t>
+            </w:r>
+          </w:p>
+        </w:tc>
+        <w:tc>
+          <w:tcPr>
+            <w:tcW w:type="dxa" w:w="720"/>
+          </w:tcPr>
+          <w:p>
+            <w:r>
+              <w:t>1.19</w:t>
+            </w:r>
+          </w:p>
+        </w:tc>
+        <w:tc>
+          <w:tcPr>
+            <w:tcW w:type="dxa" w:w="720"/>
+          </w:tcPr>
+          <w:p>
+            <w:r>
+              <w:t>1.23</w:t>
+            </w:r>
+          </w:p>
+        </w:tc>
+        <w:tc>
+          <w:tcPr>
+            <w:tcW w:type="dxa" w:w="720"/>
+          </w:tcPr>
+          <w:p>
+            <w:r>
+              <w:t>1.29</w:t>
+            </w:r>
+          </w:p>
+        </w:tc>
+        <w:tc>
+          <w:tcPr>
+            <w:tcW w:type="dxa" w:w="720"/>
+          </w:tcPr>
+          <w:p>
+            <w:r>
+              <w:t>1.35</w:t>
+            </w:r>
+          </w:p>
+        </w:tc>
+        <w:tc>
+          <w:tcPr>
+            <w:tcW w:type="dxa" w:w="720"/>
+          </w:tcPr>
+          <w:p>
+            <w:r>
+              <w:t>1.45</w:t>
+            </w:r>
+          </w:p>
+        </w:tc>
+      </w:tr>
+    </w:tbl>
+    <w:p/>
+    <w:p>
+      <w:pPr>
+        <w:jc w:val="center"/>
+      </w:pPr>
+      <w:r>
+        <w:drawing>
+          <wp:inline xmlns:a="http://schemas.openxmlformats.org/drawingml/2006/main" xmlns:pic="http://schemas.openxmlformats.org/drawingml/2006/picture">
+            <wp:extent cx="5486400" cy="2057400"/>
+            <wp:docPr id="12" name="Picture 12"/>
+            <wp:cNvGraphicFramePr>
+              <a:graphicFrameLocks noChangeAspect="1"/>
+            </wp:cNvGraphicFramePr>
+            <a:graphic>
+              <a:graphicData uri="http://schemas.openxmlformats.org/drawingml/2006/picture">
+                <pic:pic>
+                  <pic:nvPicPr>
+                    <pic:cNvPr id="0" name="gbar_I_sweep.png"/>
+                    <pic:cNvPicPr/>
+                  </pic:nvPicPr>
+                  <pic:blipFill>
+                    <a:blip r:embed="rId20"/>
+                    <a:stretch>
+                      <a:fillRect/>
+                    </a:stretch>
+                  </pic:blipFill>
+                  <pic:spPr>
+                    <a:xfrm>
+                      <a:off x="0" y="0"/>
+                      <a:ext cx="5486400" cy="2057400"/>
+                    </a:xfrm>
+                    <a:prstGeom prst="rect"/>
+                  </pic:spPr>
+                </pic:pic>
+              </a:graphicData>
+            </a:graphic>
+          </wp:inline>
+        </w:drawing>
+      </w:r>
+    </w:p>
+    <w:p>
+      <w:pPr>
+        <w:jc w:val="center"/>
+      </w:pPr>
+      <w:r>
+        <w:rPr>
+          <w:i/>
+          <w:sz w:val="18"/>
+        </w:rPr>
+        <w:t>Figure 12. Sweep 2: gating ratio and final rho vs. gGABA per synapse, SOM held at Yang's measured ~10.15 Hz. Ratio climbs slowly and smoothly, never approaching the ratio=2 criterion even at 6x Yang's conductance.</w:t>
+      </w:r>
+    </w:p>
+    <w:p>
+      <w:r>
+        <w:rPr>
+          <w:b w:val="0"/>
+          <w:i w:val="0"/>
+        </w:rPr>
+        <w:t>No gGABA value in the tested range — up to 24.0 nS/synapse (240 nS total, 6x Yang's own 40 nS spec) — recovers gating at Yang's SOM rate. The climb from 1.02 to 1.45 is smooth and decelerating, not a step; extrapolating the same trend would need on the order of 50 nS/synapse (roughly 12x Yang's value) to reach ratio=2, which is well outside any range defensible as "the same synapse, just recalibrated."</w:t>
+      </w:r>
+    </w:p>
+    <w:p>
+      <w:pPr>
+        <w:pStyle w:val="Heading3"/>
+      </w:pPr>
+      <w:r>
+        <w:t>The two sweeps together point to a temporal-patterning effect, not a conductance-amount effect</w:t>
+      </w:r>
+    </w:p>
+    <w:p>
+      <w:r>
+        <w:rPr>
+          <w:b w:val="0"/>
+          <w:i w:val="0"/>
+        </w:rPr>
+        <w:t>Comparing the two sweeps by time-averaged inhibitory conductance (ḡ_I = rate x tau_GABA,dend x gGABA_total) rather than by rate or conductance alone is revealing. Sweep 1's crossover sits between 16.87 Hz (ḡ_I ≈ 13.5 nS, fails) and 21.49 Hz (ḡ_I ≈ 17.2 nS, ratio 5.51) — only about 1.7-2.1x Yang's own 8.0 nS default, not the 6x the Section 5.5 diagnosis estimated from comparing only the 10 Hz and 63 Hz endpoints. Sweep 2's best point (24 nS/synapse at 10.16 Hz) reaches ḡ_I ≈ 48.8 nS — nearly 3x *higher* than Sweep 1's crossover ḡ_I — and still only manages ratio 1.45.</w:t>
+      </w:r>
+    </w:p>
+    <w:p>
+      <w:r>
+        <w:rPr>
+          <w:b/>
+          <w:color w:val="B00000"/>
+        </w:rPr>
+        <w:t xml:space="preserve">Flag: </w:t>
+      </w:r>
+      <w:r>
+        <w:rPr>
+          <w:i/>
+        </w:rPr>
+        <w:t>Two conditions with comparable, or even reversed, time-averaged inhibitory conductance produce opposite gating outcomes depending on whether that conductance arrives as frequent small GABA events (high SOM rate) or infrequent large ones (low rate, boosted per-synapse gGABA). This points to the dendrite's NMDA plateau being sensitive to the temporal duty cycle of inhibition, not just its time-average: with tau_GABA,dend = 20 ms and a 10 Hz SOM rate (100 ms mean ISI), the GABA conductance fully decays for most of the inter-spike interval, leaving gaps long enough for the branch to reach the NMDA plateau and accumulate calcium regardless of how large each individual GABA event is. At &gt;=20 Hz (&lt;=50 ms ISI, closer to a few tau_GABA), consecutive events overlap enough to hold the branch below plateau continuously. This is a genuine mechanistic finding, not just a negative result, and it directly answers why Sweep 2 could not compensate for Sweep 1's rate deficit by raising conductance alone.</w:t>
+      </w:r>
+    </w:p>
+    <w:p>
+      <w:r>
+        <w:rPr>
+          <w:b w:val="0"/>
+          <w:i w:val="0"/>
+        </w:rPr>
+        <w:t>Reading this against the three Step 2d options: option A (raise gGABA at Yang's rate) is empirically ruled out within any defensible range — Sweep 2 tops out at ratio 1.45 even at 6x conductance, and the trend says reaching ratio=2 this way would need roughly 12x. Option B (reduce calcium/NMDA sensitivity so Yang's 8 nS suffices) was not directly tested by either sweep, but the temporal-patterning finding gives it a concrete mechanistic target: it would need to make the plateau's activation slow or inertial enough to bridge a ~100 ms gap between SOM spikes, which is a specific, testable hypothesis rather than a blind parameter search. Option C (document the gap) is now much better supported than a bare admission of mismatch — the gap has a specific, explicable mechanism (duty cycle vs. NMDA plateau kinetics) rather than being an unexplained ~6x scaling problem. Sweep 1 also surfaces a fourth possibility the original framing didn't consider: the minimum SOM rate for reliable gating is only about 2x Yang's, not 6x — a substantially smaller, more defensible departure from the paper than the number this project had been working with. This decision is Raghav's to make; we have not changed any parameter in response to these results.</w:t>
+      </w:r>
+    </w:p>
     <w:sectPr>
       <w:pgSz w:w="12240" w:h="15840"/>
       <w:pgMar w:top="1440" w:right="1800" w:bottom="1440" w:left="1800" w:header="720" w:footer="720" w:gutter="0"/>

</xml_diff>

<commit_message>
SOM baseline corrected to 25 Hz (duty-cycle calibration), Phase 2 migrated to analytical plasticity
</commit_message>
<xml_diff>
--- a/docs/Progress_Report.docx
+++ b/docs/Progress_Report.docx
@@ -32,7 +32,7 @@
           <w:i/>
           <w:sz w:val="18"/>
         </w:rPr>
-        <w:t>This is a living document. Sections are dated and appended chronologically; nothing above is rewritten once written. Compiled 2026-08-29.</w:t>
+        <w:t>This is a living document. Sections are dated and appended chronologically; nothing above is rewritten once written. Compiled 2026-08-31.</w:t>
       </w:r>
     </w:p>
     <w:p/>
@@ -4507,6 +4507,1257 @@
         <w:t>Reading this against the three Step 2d options: option A (raise gGABA at Yang's rate) is empirically ruled out within any defensible range — Sweep 2 tops out at ratio 1.45 even at 6x conductance, and the trend says reaching ratio=2 this way would need roughly 12x. Option B (reduce calcium/NMDA sensitivity so Yang's 8 nS suffices) was not directly tested by either sweep, but the temporal-patterning finding gives it a concrete mechanistic target: it would need to make the plateau's activation slow or inertial enough to bridge a ~100 ms gap between SOM spikes, which is a specific, testable hypothesis rather than a blind parameter search. Option C (document the gap) is now much better supported than a bare admission of mismatch — the gap has a specific, explicable mechanism (duty cycle vs. NMDA plateau kinetics) rather than being an unexplained ~6x scaling problem. Sweep 1 also surfaces a fourth possibility the original framing didn't consider: the minimum SOM rate for reliable gating is only about 2x Yang's, not 6x — a substantially smaller, more defensible departure from the paper than the number this project had been working with. This decision is Raghav's to make; we have not changed any parameter in response to these results.</w:t>
       </w:r>
     </w:p>
+    <w:p>
+      <w:pPr>
+        <w:pStyle w:val="Heading1"/>
+      </w:pPr>
+      <w:r>
+        <w:t>8. 2026-08-31 update — 25 Hz SOM baseline adopted, and Phase 2 rerun honestly under the analytical plasticity update</w:t>
+      </w:r>
+    </w:p>
+    <w:p>
+      <w:r>
+        <w:rPr>
+          <w:b w:val="0"/>
+          <w:i w:val="0"/>
+        </w:rPr>
+        <w:t>Section 7 ended with a decision left open (which of the Step 2d options to take on the SOM-rate gap) and a debt outstanding (both Phase 2 figures retired as stale, generated before the plasticity migration and the bug fix — Section 7.2). This entry closes both. It records the calibration choice we actually committed to the code, then reports the Phase 1 re-confirmation and the first honest rerun of both Phase 2 sweeps under the epoch-based analytical update. Every number below is copied from a JSON written by the rerun itself (docs/phase2_snr_sweep_results.json, docs/phase2_ketamine_sweep_results.json, figures/validation_vs_papers/results.json) or from the parameters.py comment that records the calibration.</w:t>
+      </w:r>
+    </w:p>
+    <w:p>
+      <w:pPr>
+        <w:pStyle w:val="Heading2"/>
+      </w:pPr>
+      <w:r>
+        <w:t>8.1 The SOM baseline is now set to ~25 Hz, on a duty-cycle argument</w:t>
+      </w:r>
+    </w:p>
+    <w:p>
+      <w:r>
+        <w:rPr>
+          <w:b w:val="0"/>
+          <w:i w:val="0"/>
+        </w:rPr>
+        <w:t>Section 7.3's two sweeps did the deciding. The clean finding there was that gating is governed by the temporal duty cycle of dendritic inhibition — whether GABA covers the gap between SOM spikes relative to tau_GABA,dend = 20 ms — and not by the time-averaged inhibitory charge (cross-referenced: Section 7.3, "the two sweeps together"). Yang's own ~10 Hz rate leaves ~100 ms inter-spike gaps, far longer than the 20 ms GABA decay, so the branch reaches its NMDA plateau between spikes no matter how large each GABA event is (Sweep 2 topped out at ratio 1.45 even at 6x Yang's conductance). Sweep 1 located the fail-&gt;pass step between 16.87 Hz (ratio 1.04) and 21.49 Hz (ratio 5.51), with the peak at 25.29 Hz (ratio 5.58).</w:t>
+      </w:r>
+    </w:p>
+    <w:p>
+      <w:r>
+        <w:rPr>
+          <w:b/>
+          <w:color w:val="B00000"/>
+        </w:rPr>
+        <w:t xml:space="preserve">Flag: </w:t>
+      </w:r>
+      <w:r>
+        <w:rPr>
+          <w:i/>
+        </w:rPr>
+        <w:t>We set the SOM bias current to 20.9 pA, calibrated to 25.29 Hz in Phase-1's reduced circuit — the sweep's peak point — rather than to Yang's 10 Hz (model/parameters.py, iBaseline_som). This is a ~2.5x departure from Yang's reported rate, but it is now a *justified* one: &gt;= ~20 Hz is the rate at which 20 ms of GABA coverage stops being outrun by the inter-spike interval, which is a specific biophysical criterion rather than an unexplained recalibration. Two honest caveats are recorded in the code and kept here: (i) the value is NOT portable across circuits — the same 20.9 pA produces a different rate depending on what else is wired to SOM, so full_circuit.py must measure its own SOM rate and be checked against the same &gt;= ~20 Hz target rather than inheriting the number; and (ii) this is still a departure from the paper we are modelling, so the gap is documented, not hidden (Step 2d option C), now with a mechanism attached.</w:t>
+      </w:r>
+    </w:p>
+    <w:p>
+      <w:pPr>
+        <w:pStyle w:val="Heading2"/>
+      </w:pPr>
+      <w:r>
+        <w:t>8.2 Phase 1 gating re-confirmed under the 25 Hz default</w:t>
+      </w:r>
+    </w:p>
+    <w:p>
+      <w:r>
+        <w:rPr>
+          <w:b w:val="0"/>
+          <w:i w:val="0"/>
+        </w:rPr>
+        <w:t>With the 25 Hz baseline in place, we re-ran the Phase-1 single-neuron analytical protocol to confirm the headline branch-specific gating result still holds — this is the number Section 2.2 flagged as not yet stable across implementations, so re-pinning it under the committed calibration matters.</w:t>
+      </w:r>
+    </w:p>
+    <w:tbl>
+      <w:tblPr>
+        <w:tblStyle w:val="LightGrid-Accent1"/>
+        <w:tblW w:type="auto" w:w="0"/>
+        <w:tblLook w:firstColumn="1" w:firstRow="1" w:lastColumn="0" w:lastRow="0" w:noHBand="0" w:noVBand="1" w:val="04A0"/>
+      </w:tblPr>
+      <w:tblGrid>
+        <w:gridCol w:w="4320"/>
+        <w:gridCol w:w="4320"/>
+      </w:tblGrid>
+      <w:tr>
+        <w:tc>
+          <w:tcPr>
+            <w:tcW w:type="dxa" w:w="4320"/>
+          </w:tcPr>
+          <w:p>
+            <w:r>
+              <w:rPr>
+                <w:b/>
+              </w:rPr>
+              <w:t>quantity</w:t>
+            </w:r>
+          </w:p>
+        </w:tc>
+        <w:tc>
+          <w:tcPr>
+            <w:tcW w:type="dxa" w:w="4320"/>
+          </w:tcPr>
+          <w:p>
+            <w:r>
+              <w:rPr>
+                <w:b/>
+              </w:rPr>
+              <w:t>value</w:t>
+            </w:r>
+          </w:p>
+        </w:tc>
+      </w:tr>
+      <w:tr>
+        <w:tc>
+          <w:tcPr>
+            <w:tcW w:type="dxa" w:w="4320"/>
+          </w:tcPr>
+          <w:p>
+            <w:r>
+              <w:t>free-branch rho (uninhibited)</w:t>
+            </w:r>
+          </w:p>
+        </w:tc>
+        <w:tc>
+          <w:tcPr>
+            <w:tcW w:type="dxa" w:w="4320"/>
+          </w:tcPr>
+          <w:p>
+            <w:r>
+              <w:t>0.9249</w:t>
+            </w:r>
+          </w:p>
+        </w:tc>
+      </w:tr>
+      <w:tr>
+        <w:tc>
+          <w:tcPr>
+            <w:tcW w:type="dxa" w:w="4320"/>
+          </w:tcPr>
+          <w:p>
+            <w:r>
+              <w:t>inhibited-branch rho</w:t>
+            </w:r>
+          </w:p>
+        </w:tc>
+        <w:tc>
+          <w:tcPr>
+            <w:tcW w:type="dxa" w:w="4320"/>
+          </w:tcPr>
+          <w:p>
+            <w:r>
+              <w:t>0.1658</w:t>
+            </w:r>
+          </w:p>
+        </w:tc>
+      </w:tr>
+      <w:tr>
+        <w:tc>
+          <w:tcPr>
+            <w:tcW w:type="dxa" w:w="4320"/>
+          </w:tcPr>
+          <w:p>
+            <w:r>
+              <w:t>gating ratio (free / inhibited)</w:t>
+            </w:r>
+          </w:p>
+        </w:tc>
+        <w:tc>
+          <w:tcPr>
+            <w:tcW w:type="dxa" w:w="4320"/>
+          </w:tcPr>
+          <w:p>
+            <w:r>
+              <w:t>5.5786</w:t>
+            </w:r>
+          </w:p>
+        </w:tc>
+      </w:tr>
+    </w:tbl>
+    <w:p/>
+    <w:p>
+      <w:pPr>
+        <w:jc w:val="center"/>
+      </w:pPr>
+      <w:r>
+        <w:drawing>
+          <wp:inline xmlns:a="http://schemas.openxmlformats.org/drawingml/2006/main" xmlns:pic="http://schemas.openxmlformats.org/drawingml/2006/picture">
+            <wp:extent cx="5486400" cy="2057400"/>
+            <wp:docPr id="13" name="Picture 13"/>
+            <wp:cNvGraphicFramePr>
+              <a:graphicFrameLocks noChangeAspect="1"/>
+            </wp:cNvGraphicFramePr>
+            <a:graphic>
+              <a:graphicData uri="http://schemas.openxmlformats.org/drawingml/2006/picture">
+                <pic:pic>
+                  <pic:nvPicPr>
+                    <pic:cNvPr id="0" name="analytical_plasticity_trajectory_som25hz_default.png"/>
+                    <pic:cNvPicPr/>
+                  </pic:nvPicPr>
+                  <pic:blipFill>
+                    <a:blip r:embed="rId21"/>
+                    <a:stretch>
+                      <a:fillRect/>
+                    </a:stretch>
+                  </pic:blipFill>
+                  <pic:spPr>
+                    <a:xfrm>
+                      <a:off x="0" y="0"/>
+                      <a:ext cx="5486400" cy="2057400"/>
+                    </a:xfrm>
+                    <a:prstGeom prst="rect"/>
+                  </pic:spPr>
+                </pic:pic>
+              </a:graphicData>
+            </a:graphic>
+          </wp:inline>
+        </w:drawing>
+      </w:r>
+    </w:p>
+    <w:p>
+      <w:pPr>
+        <w:jc w:val="center"/>
+      </w:pPr>
+      <w:r>
+        <w:rPr>
+          <w:i/>
+          <w:sz w:val="18"/>
+        </w:rPr>
+        <w:t>Figure 13. Phase-1 analytical plasticity trajectory under the committed 25 Hz SOM default: the free branch potentiates to rho ~0.92 while the SOM-inhibited branch is held down to rho ~0.17, a gating ratio of 5.58.</w:t>
+      </w:r>
+    </w:p>
+    <w:p>
+      <w:r>
+        <w:rPr>
+          <w:b w:val="0"/>
+          <w:i w:val="0"/>
+        </w:rPr>
+        <w:t>This sits essentially on top of the sweep's own peak (ratio 5.58 at 25.29 Hz, Section 7.3) and is reproduced independently by the paper-replication battery below (V3: ratio 5.50). For the first time in this project the Phase-1 headline ratio agrees to within ~1.5% across three separate code paths, which is the stability Section 2.2 said was missing. It is an honest ~5.6, not the ~43-62 the earlier bugged/ODE runs reported.</w:t>
+      </w:r>
+    </w:p>
+    <w:p>
+      <w:pPr>
+        <w:pStyle w:val="Heading2"/>
+      </w:pPr>
+      <w:r>
+        <w:t>8.3 Phase 2 rerun — the first honest sweeps under analytical plasticity</w:t>
+      </w:r>
+    </w:p>
+    <w:p>
+      <w:r>
+        <w:rPr>
+          <w:b w:val="0"/>
+          <w:i w:val="0"/>
+        </w:rPr>
+        <w:t>Section 7.2 retired both Phase 2 figures because they were generated before the plasticity migration (frozen rho, ratios in the old bugged ~62 range). Both scripts were migrated to the epoch-loop + analytical-update pattern and rerun from scratch. The point of comparison is therefore qualitative: does the *phenomenon* survive an honest plasticity model, and where does it now break — not a like-for-like delta against the retired numbers.</w:t>
+      </w:r>
+    </w:p>
+    <w:p>
+      <w:pPr>
+        <w:pStyle w:val="Heading3"/>
+      </w:pPr>
+      <w:r>
+        <w:t>8.3a Noise robustness (Phase 2B) — gating collapses as noise starves the SOM rate</w:t>
+      </w:r>
+    </w:p>
+    <w:tbl>
+      <w:tblPr>
+        <w:tblStyle w:val="LightGrid-Accent1"/>
+        <w:tblW w:type="auto" w:w="0"/>
+        <w:tblLook w:firstColumn="1" w:firstRow="1" w:lastColumn="0" w:lastRow="0" w:noHBand="0" w:noVBand="1" w:val="04A0"/>
+      </w:tblPr>
+      <w:tblGrid>
+        <w:gridCol w:w="960"/>
+        <w:gridCol w:w="960"/>
+        <w:gridCol w:w="960"/>
+        <w:gridCol w:w="960"/>
+        <w:gridCol w:w="960"/>
+        <w:gridCol w:w="960"/>
+        <w:gridCol w:w="960"/>
+        <w:gridCol w:w="960"/>
+        <w:gridCol w:w="960"/>
+      </w:tblGrid>
+      <w:tr>
+        <w:tc>
+          <w:tcPr>
+            <w:tcW w:type="dxa" w:w="960"/>
+          </w:tcPr>
+          <w:p>
+            <w:r>
+              <w:rPr>
+                <w:b/>
+              </w:rPr>
+              <w:t>noise level</w:t>
+            </w:r>
+          </w:p>
+        </w:tc>
+        <w:tc>
+          <w:tcPr>
+            <w:tcW w:type="dxa" w:w="960"/>
+          </w:tcPr>
+          <w:p>
+            <w:r>
+              <w:rPr>
+                <w:b/>
+              </w:rPr>
+              <w:t>0.0</w:t>
+            </w:r>
+          </w:p>
+        </w:tc>
+        <w:tc>
+          <w:tcPr>
+            <w:tcW w:type="dxa" w:w="960"/>
+          </w:tcPr>
+          <w:p>
+            <w:r>
+              <w:rPr>
+                <w:b/>
+              </w:rPr>
+              <w:t>0.25</w:t>
+            </w:r>
+          </w:p>
+        </w:tc>
+        <w:tc>
+          <w:tcPr>
+            <w:tcW w:type="dxa" w:w="960"/>
+          </w:tcPr>
+          <w:p>
+            <w:r>
+              <w:rPr>
+                <w:b/>
+              </w:rPr>
+              <w:t>0.30</w:t>
+            </w:r>
+          </w:p>
+        </w:tc>
+        <w:tc>
+          <w:tcPr>
+            <w:tcW w:type="dxa" w:w="960"/>
+          </w:tcPr>
+          <w:p>
+            <w:r>
+              <w:rPr>
+                <w:b/>
+              </w:rPr>
+              <w:t>0.35</w:t>
+            </w:r>
+          </w:p>
+        </w:tc>
+        <w:tc>
+          <w:tcPr>
+            <w:tcW w:type="dxa" w:w="960"/>
+          </w:tcPr>
+          <w:p>
+            <w:r>
+              <w:rPr>
+                <w:b/>
+              </w:rPr>
+              <w:t>0.40</w:t>
+            </w:r>
+          </w:p>
+        </w:tc>
+        <w:tc>
+          <w:tcPr>
+            <w:tcW w:type="dxa" w:w="960"/>
+          </w:tcPr>
+          <w:p>
+            <w:r>
+              <w:rPr>
+                <w:b/>
+              </w:rPr>
+              <w:t>0.45</w:t>
+            </w:r>
+          </w:p>
+        </w:tc>
+        <w:tc>
+          <w:tcPr>
+            <w:tcW w:type="dxa" w:w="960"/>
+          </w:tcPr>
+          <w:p>
+            <w:r>
+              <w:rPr>
+                <w:b/>
+              </w:rPr>
+              <w:t>0.50</w:t>
+            </w:r>
+          </w:p>
+        </w:tc>
+        <w:tc>
+          <w:tcPr>
+            <w:tcW w:type="dxa" w:w="960"/>
+          </w:tcPr>
+          <w:p>
+            <w:r>
+              <w:rPr>
+                <w:b/>
+              </w:rPr>
+              <w:t>&gt;=0.75</w:t>
+            </w:r>
+          </w:p>
+        </w:tc>
+      </w:tr>
+      <w:tr>
+        <w:tc>
+          <w:tcPr>
+            <w:tcW w:type="dxa" w:w="960"/>
+          </w:tcPr>
+          <w:p>
+            <w:r>
+              <w:t>gating ratio</w:t>
+            </w:r>
+          </w:p>
+        </w:tc>
+        <w:tc>
+          <w:tcPr>
+            <w:tcW w:type="dxa" w:w="960"/>
+          </w:tcPr>
+          <w:p>
+            <w:r>
+              <w:t>3.30</w:t>
+            </w:r>
+          </w:p>
+        </w:tc>
+        <w:tc>
+          <w:tcPr>
+            <w:tcW w:type="dxa" w:w="960"/>
+          </w:tcPr>
+          <w:p>
+            <w:r>
+              <w:t>2.77</w:t>
+            </w:r>
+          </w:p>
+        </w:tc>
+        <w:tc>
+          <w:tcPr>
+            <w:tcW w:type="dxa" w:w="960"/>
+          </w:tcPr>
+          <w:p>
+            <w:r>
+              <w:t>2.30</w:t>
+            </w:r>
+          </w:p>
+        </w:tc>
+        <w:tc>
+          <w:tcPr>
+            <w:tcW w:type="dxa" w:w="960"/>
+          </w:tcPr>
+          <w:p>
+            <w:r>
+              <w:t>1.73</w:t>
+            </w:r>
+          </w:p>
+        </w:tc>
+        <w:tc>
+          <w:tcPr>
+            <w:tcW w:type="dxa" w:w="960"/>
+          </w:tcPr>
+          <w:p>
+            <w:r>
+              <w:t>1.10</w:t>
+            </w:r>
+          </w:p>
+        </w:tc>
+        <w:tc>
+          <w:tcPr>
+            <w:tcW w:type="dxa" w:w="960"/>
+          </w:tcPr>
+          <w:p>
+            <w:r>
+              <w:t>1.02</w:t>
+            </w:r>
+          </w:p>
+        </w:tc>
+        <w:tc>
+          <w:tcPr>
+            <w:tcW w:type="dxa" w:w="960"/>
+          </w:tcPr>
+          <w:p>
+            <w:r>
+              <w:t>1.00</w:t>
+            </w:r>
+          </w:p>
+        </w:tc>
+        <w:tc>
+          <w:tcPr>
+            <w:tcW w:type="dxa" w:w="960"/>
+          </w:tcPr>
+          <w:p>
+            <w:r>
+              <w:t>~1.00</w:t>
+            </w:r>
+          </w:p>
+        </w:tc>
+      </w:tr>
+      <w:tr>
+        <w:tc>
+          <w:tcPr>
+            <w:tcW w:type="dxa" w:w="960"/>
+          </w:tcPr>
+          <w:p>
+            <w:r>
+              <w:t>measured SOM rate (Hz)</w:t>
+            </w:r>
+          </w:p>
+        </w:tc>
+        <w:tc>
+          <w:tcPr>
+            <w:tcW w:type="dxa" w:w="960"/>
+          </w:tcPr>
+          <w:p>
+            <w:r>
+              <w:t>25.3</w:t>
+            </w:r>
+          </w:p>
+        </w:tc>
+        <w:tc>
+          <w:tcPr>
+            <w:tcW w:type="dxa" w:w="960"/>
+          </w:tcPr>
+          <w:p>
+            <w:r>
+              <w:t>42.2</w:t>
+            </w:r>
+          </w:p>
+        </w:tc>
+        <w:tc>
+          <w:tcPr>
+            <w:tcW w:type="dxa" w:w="960"/>
+          </w:tcPr>
+          <w:p>
+            <w:r>
+              <w:t>38.6</w:t>
+            </w:r>
+          </w:p>
+        </w:tc>
+        <w:tc>
+          <w:tcPr>
+            <w:tcW w:type="dxa" w:w="960"/>
+          </w:tcPr>
+          <w:p>
+            <w:r>
+              <w:t>29.7</w:t>
+            </w:r>
+          </w:p>
+        </w:tc>
+        <w:tc>
+          <w:tcPr>
+            <w:tcW w:type="dxa" w:w="960"/>
+          </w:tcPr>
+          <w:p>
+            <w:r>
+              <w:t>16.7</w:t>
+            </w:r>
+          </w:p>
+        </w:tc>
+        <w:tc>
+          <w:tcPr>
+            <w:tcW w:type="dxa" w:w="960"/>
+          </w:tcPr>
+          <w:p>
+            <w:r>
+              <w:t>6.7</w:t>
+            </w:r>
+          </w:p>
+        </w:tc>
+        <w:tc>
+          <w:tcPr>
+            <w:tcW w:type="dxa" w:w="960"/>
+          </w:tcPr>
+          <w:p>
+            <w:r>
+              <w:t>1.8</w:t>
+            </w:r>
+          </w:p>
+        </w:tc>
+        <w:tc>
+          <w:tcPr>
+            <w:tcW w:type="dxa" w:w="960"/>
+          </w:tcPr>
+          <w:p>
+            <w:r>
+              <w:t>~0</w:t>
+            </w:r>
+          </w:p>
+        </w:tc>
+      </w:tr>
+    </w:tbl>
+    <w:p/>
+    <w:p>
+      <w:pPr>
+        <w:jc w:val="center"/>
+      </w:pPr>
+      <w:r>
+        <w:drawing>
+          <wp:inline xmlns:a="http://schemas.openxmlformats.org/drawingml/2006/main" xmlns:pic="http://schemas.openxmlformats.org/drawingml/2006/picture">
+            <wp:extent cx="5486400" cy="4114800"/>
+            <wp:docPr id="14" name="Picture 14"/>
+            <wp:cNvGraphicFramePr>
+              <a:graphicFrameLocks noChangeAspect="1"/>
+            </wp:cNvGraphicFramePr>
+            <a:graphic>
+              <a:graphicData uri="http://schemas.openxmlformats.org/drawingml/2006/picture">
+                <pic:pic>
+                  <pic:nvPicPr>
+                    <pic:cNvPr id="0" name="phase2_snr_curve.png"/>
+                    <pic:cNvPicPr/>
+                  </pic:nvPicPr>
+                  <pic:blipFill>
+                    <a:blip r:embed="rId14"/>
+                    <a:stretch>
+                      <a:fillRect/>
+                    </a:stretch>
+                  </pic:blipFill>
+                  <pic:spPr>
+                    <a:xfrm>
+                      <a:off x="0" y="0"/>
+                      <a:ext cx="5486400" cy="4114800"/>
+                    </a:xfrm>
+                    <a:prstGeom prst="rect"/>
+                  </pic:spPr>
+                </pic:pic>
+              </a:graphicData>
+            </a:graphic>
+          </wp:inline>
+        </w:drawing>
+      </w:r>
+    </w:p>
+    <w:p>
+      <w:pPr>
+        <w:jc w:val="center"/>
+      </w:pPr>
+      <w:r>
+        <w:rPr>
+          <w:i/>
+          <w:sz w:val="18"/>
+        </w:rPr>
+        <w:t>Figure 14. Phase 2B: gating ratio vs. injected noise level under the analytical update and 25 Hz SOM baseline. Selectivity falls and stays below 1.5 from noise level 0.40 onward; the collapse tracks the SOM rate dropping through the ~20 Hz duty-cycle threshold identified in Section 7.3.</w:t>
+      </w:r>
+    </w:p>
+    <w:p>
+      <w:r>
+        <w:rPr>
+          <w:b w:val="0"/>
+          <w:i w:val="0"/>
+        </w:rPr>
+        <w:t>The breaking point is a noise level of ~0.35-0.40: ratio holds above 2 through 0.30 (2.30), is marginal at 0.35 (1.73), and has collapsed to 1.10 by 0.40, staying below 1.5 thereafter. The mechanism ties directly back to Section 7.3: noise degrades the measured SOM rate, and gating fails almost exactly where that rate crosses below the ~20 Hz duty-cycle threshold — at noise 0.40 the SOM rate has fallen to 16.7 Hz (below threshold, ratio 1.10), while at 0.30 it is still 38.6 Hz (above, ratio 2.30). So Phase 2B is not an independent robustness result; it is the Section 7.3 duty-cycle finding seen again through a different knob. The high ratio_sem at noise 0.0 (1.16 on a mean of 3.30) is worth noting — the zero-noise point is the noisiest across seeds, which we have not yet diagnosed.</w:t>
+      </w:r>
+    </w:p>
+    <w:p>
+      <w:r>
+        <w:rPr>
+          <w:b/>
+          <w:color w:val="B00000"/>
+        </w:rPr>
+        <w:t xml:space="preserve">Flag: </w:t>
+      </w:r>
+      <w:r>
+        <w:rPr>
+          <w:i/>
+        </w:rPr>
+        <w:t>Breaking point did shift meaningfully vs. the retired figures, but the shift is in magnitude, not existence. The phenomenon (noise abolishes branch-specific gating) survives the honest plasticity model, but the peak ratio is ~3.3, not the retired ~62 — the collapse now happens from a realistic ceiling, and it has an explicit cause (SOM rate falling through the duty-cycle threshold) rather than being an unexplained fall from an inflated number.</w:t>
+      </w:r>
+    </w:p>
+    <w:p>
+      <w:pPr>
+        <w:pStyle w:val="Heading3"/>
+      </w:pPr>
+      <w:r>
+        <w:t>8.3b MD-&gt;VIP disinhibition (Phase 2C) — the schizophrenia/ketamine failure mode</w:t>
+      </w:r>
+    </w:p>
+    <w:tbl>
+      <w:tblPr>
+        <w:tblStyle w:val="LightGrid-Accent1"/>
+        <w:tblW w:type="auto" w:w="0"/>
+        <w:tblLook w:firstColumn="1" w:firstRow="1" w:lastColumn="0" w:lastRow="0" w:noHBand="0" w:noVBand="1" w:val="04A0"/>
+      </w:tblPr>
+      <w:tblGrid>
+        <w:gridCol w:w="1728"/>
+        <w:gridCol w:w="1728"/>
+        <w:gridCol w:w="1728"/>
+        <w:gridCol w:w="1728"/>
+        <w:gridCol w:w="1728"/>
+      </w:tblGrid>
+      <w:tr>
+        <w:tc>
+          <w:tcPr>
+            <w:tcW w:type="dxa" w:w="1728"/>
+          </w:tcPr>
+          <w:p>
+            <w:r>
+              <w:rPr>
+                <w:b/>
+              </w:rPr>
+              <w:t>MD-&gt;VIP scale</w:t>
+            </w:r>
+          </w:p>
+        </w:tc>
+        <w:tc>
+          <w:tcPr>
+            <w:tcW w:type="dxa" w:w="1728"/>
+          </w:tcPr>
+          <w:p>
+            <w:r>
+              <w:rPr>
+                <w:b/>
+              </w:rPr>
+              <w:t>1.0 (intact)</w:t>
+            </w:r>
+          </w:p>
+        </w:tc>
+        <w:tc>
+          <w:tcPr>
+            <w:tcW w:type="dxa" w:w="1728"/>
+          </w:tcPr>
+          <w:p>
+            <w:r>
+              <w:rPr>
+                <w:b/>
+              </w:rPr>
+              <w:t>0.66</w:t>
+            </w:r>
+          </w:p>
+        </w:tc>
+        <w:tc>
+          <w:tcPr>
+            <w:tcW w:type="dxa" w:w="1728"/>
+          </w:tcPr>
+          <w:p>
+            <w:r>
+              <w:rPr>
+                <w:b/>
+              </w:rPr>
+              <w:t>0.33</w:t>
+            </w:r>
+          </w:p>
+        </w:tc>
+        <w:tc>
+          <w:tcPr>
+            <w:tcW w:type="dxa" w:w="1728"/>
+          </w:tcPr>
+          <w:p>
+            <w:r>
+              <w:rPr>
+                <w:b/>
+              </w:rPr>
+              <w:t>0.0 (full block)</w:t>
+            </w:r>
+          </w:p>
+        </w:tc>
+      </w:tr>
+      <w:tr>
+        <w:tc>
+          <w:tcPr>
+            <w:tcW w:type="dxa" w:w="1728"/>
+          </w:tcPr>
+          <w:p>
+            <w:r>
+              <w:t>gating ratio</w:t>
+            </w:r>
+          </w:p>
+        </w:tc>
+        <w:tc>
+          <w:tcPr>
+            <w:tcW w:type="dxa" w:w="1728"/>
+          </w:tcPr>
+          <w:p>
+            <w:r>
+              <w:t>1.00</w:t>
+            </w:r>
+          </w:p>
+        </w:tc>
+        <w:tc>
+          <w:tcPr>
+            <w:tcW w:type="dxa" w:w="1728"/>
+          </w:tcPr>
+          <w:p>
+            <w:r>
+              <w:t>1.00</w:t>
+            </w:r>
+          </w:p>
+        </w:tc>
+        <w:tc>
+          <w:tcPr>
+            <w:tcW w:type="dxa" w:w="1728"/>
+          </w:tcPr>
+          <w:p>
+            <w:r>
+              <w:t>3.29</w:t>
+            </w:r>
+          </w:p>
+        </w:tc>
+        <w:tc>
+          <w:tcPr>
+            <w:tcW w:type="dxa" w:w="1728"/>
+          </w:tcPr>
+          <w:p>
+            <w:r>
+              <w:t>3.42</w:t>
+            </w:r>
+          </w:p>
+        </w:tc>
+      </w:tr>
+      <w:tr>
+        <w:tc>
+          <w:tcPr>
+            <w:tcW w:type="dxa" w:w="1728"/>
+          </w:tcPr>
+          <w:p>
+            <w:r>
+              <w:t>SOM rate (Hz)</w:t>
+            </w:r>
+          </w:p>
+        </w:tc>
+        <w:tc>
+          <w:tcPr>
+            <w:tcW w:type="dxa" w:w="1728"/>
+          </w:tcPr>
+          <w:p>
+            <w:r>
+              <w:t>0.0</w:t>
+            </w:r>
+          </w:p>
+        </w:tc>
+        <w:tc>
+          <w:tcPr>
+            <w:tcW w:type="dxa" w:w="1728"/>
+          </w:tcPr>
+          <w:p>
+            <w:r>
+              <w:t>1.3</w:t>
+            </w:r>
+          </w:p>
+        </w:tc>
+        <w:tc>
+          <w:tcPr>
+            <w:tcW w:type="dxa" w:w="1728"/>
+          </w:tcPr>
+          <w:p>
+            <w:r>
+              <w:t>25.3</w:t>
+            </w:r>
+          </w:p>
+        </w:tc>
+        <w:tc>
+          <w:tcPr>
+            <w:tcW w:type="dxa" w:w="1728"/>
+          </w:tcPr>
+          <w:p>
+            <w:r>
+              <w:t>25.3</w:t>
+            </w:r>
+          </w:p>
+        </w:tc>
+      </w:tr>
+      <w:tr>
+        <w:tc>
+          <w:tcPr>
+            <w:tcW w:type="dxa" w:w="1728"/>
+          </w:tcPr>
+          <w:p>
+            <w:r>
+              <w:t>VIP rate (Hz)</w:t>
+            </w:r>
+          </w:p>
+        </w:tc>
+        <w:tc>
+          <w:tcPr>
+            <w:tcW w:type="dxa" w:w="1728"/>
+          </w:tcPr>
+          <w:p>
+            <w:r>
+              <w:t>28.4</w:t>
+            </w:r>
+          </w:p>
+        </w:tc>
+        <w:tc>
+          <w:tcPr>
+            <w:tcW w:type="dxa" w:w="1728"/>
+          </w:tcPr>
+          <w:p>
+            <w:r>
+              <w:t>4.0</w:t>
+            </w:r>
+          </w:p>
+        </w:tc>
+        <w:tc>
+          <w:tcPr>
+            <w:tcW w:type="dxa" w:w="1728"/>
+          </w:tcPr>
+          <w:p>
+            <w:r>
+              <w:t>0.0</w:t>
+            </w:r>
+          </w:p>
+        </w:tc>
+        <w:tc>
+          <w:tcPr>
+            <w:tcW w:type="dxa" w:w="1728"/>
+          </w:tcPr>
+          <w:p>
+            <w:r>
+              <w:t>0.0</w:t>
+            </w:r>
+          </w:p>
+        </w:tc>
+      </w:tr>
+    </w:tbl>
+    <w:p/>
+    <w:p>
+      <w:pPr>
+        <w:jc w:val="center"/>
+      </w:pPr>
+      <w:r>
+        <w:drawing>
+          <wp:inline xmlns:a="http://schemas.openxmlformats.org/drawingml/2006/main" xmlns:pic="http://schemas.openxmlformats.org/drawingml/2006/picture">
+            <wp:extent cx="5486400" cy="2468880"/>
+            <wp:docPr id="15" name="Picture 15"/>
+            <wp:cNvGraphicFramePr>
+              <a:graphicFrameLocks noChangeAspect="1"/>
+            </wp:cNvGraphicFramePr>
+            <a:graphic>
+              <a:graphicData uri="http://schemas.openxmlformats.org/drawingml/2006/picture">
+                <pic:pic>
+                  <pic:nvPicPr>
+                    <pic:cNvPr id="0" name="phase2_ketamine_failure.png"/>
+                    <pic:cNvPicPr/>
+                  </pic:nvPicPr>
+                  <pic:blipFill>
+                    <a:blip r:embed="rId15"/>
+                    <a:stretch>
+                      <a:fillRect/>
+                    </a:stretch>
+                  </pic:blipFill>
+                  <pic:spPr>
+                    <a:xfrm>
+                      <a:off x="0" y="0"/>
+                      <a:ext cx="5486400" cy="2468880"/>
+                    </a:xfrm>
+                    <a:prstGeom prst="rect"/>
+                  </pic:spPr>
+                </pic:pic>
+              </a:graphicData>
+            </a:graphic>
+          </wp:inline>
+        </w:drawing>
+      </w:r>
+    </w:p>
+    <w:p>
+      <w:pPr>
+        <w:jc w:val="center"/>
+      </w:pPr>
+      <w:r>
+        <w:rPr>
+          <w:i/>
+          <w:sz w:val="18"/>
+        </w:rPr>
+        <w:t>Figure 15. Phase 2C: gating ratio vs. MD-&gt;VIP drive scale. Intact MD-&gt;VIP drive (scale 1.0) fires VIP at 28 Hz, which silences SOM (0 Hz) and abolishes gating (ratio 1.0); attenuating MD-&gt;VIP restores SOM to its 25 Hz baseline and recovers gating (ratio ~3.4).</w:t>
+      </w:r>
+    </w:p>
+    <w:p>
+      <w:r>
+        <w:rPr>
+          <w:b w:val="0"/>
+          <w:i w:val="0"/>
+        </w:rPr>
+        <w:t>The circuit logic reads cleanly: strong MD-&gt;VIP drive fires VIP (28 Hz at intact scale), VIP inhibits SOM to silence (0 Hz), and with SOM below the duty-cycle threshold gating is abolished (ratio 1.00). Attenuating MD-&gt;VIP releases SOM back to its 25 Hz baseline and gating returns — ratio 3.29 at scale 0.33 and 3.42 at full block. The transition is a step between scale 0.66 (ratio 1.00, SOM 1.3 Hz) and 0.33 (ratio 3.29, SOM 25.3 Hz), the same near-threshold sharpness seen in Section 7.3's rate sweep. Once again the pass/fail line coincides with SOM crossing ~20 Hz — the three Phase-2 knobs (noise, MD-&gt;VIP drive, and the Section 7.3 direct rate sweep) all break at the same underlying place.</w:t>
+      </w:r>
+    </w:p>
+    <w:p>
+      <w:r>
+        <w:rPr>
+          <w:b/>
+          <w:color w:val="B00000"/>
+        </w:rPr>
+        <w:t xml:space="preserve">Flag: </w:t>
+      </w:r>
+      <w:r>
+        <w:rPr>
+          <w:i/>
+        </w:rPr>
+        <w:t>This is the same qualitative failure mode the retired figure showed (excess MD-&gt;VIP disinhibition breaks gating — the model's proposed schizophrenia/ketamine analogue), so the breaking point did not move in kind: gating is lost once MD-&gt;VIP scale exceeds ~0.33-0.5. What changed is the honest ceiling it falls from (~3.4, not the retired ~62) and that the failure now has an explicit intermediary — VIP silencing SOM below the duty-cycle threshold — rather than an unexplained collapse.</w:t>
+      </w:r>
+    </w:p>
+    <w:p>
+      <w:pPr>
+        <w:pStyle w:val="Heading2"/>
+      </w:pPr>
+      <w:r>
+        <w:t>8.4 Paper-replication battery still sane under the new calibration</w:t>
+      </w:r>
+    </w:p>
+    <w:p>
+      <w:r>
+        <w:rPr>
+          <w:b w:val="0"/>
+          <w:i w:val="0"/>
+        </w:rPr>
+        <w:t>Finally, the four-panel validation-against-papers battery was rerun end-to-end under the analytical update and 25 Hz baseline (figures/validation_vs_papers/, results.json). The question is whether recalibrating SOM broke any of the qualitative behaviours the model is supposed to reproduce. It did not — all four remain directionally correct.</w:t>
+      </w:r>
+    </w:p>
+    <w:tbl>
+      <w:tblPr>
+        <w:tblStyle w:val="LightGrid-Accent1"/>
+        <w:tblW w:type="auto" w:w="0"/>
+        <w:tblLook w:firstColumn="1" w:firstRow="1" w:lastColumn="0" w:lastRow="0" w:noHBand="0" w:noVBand="1" w:val="04A0"/>
+      </w:tblPr>
+      <w:tblGrid>
+        <w:gridCol w:w="2880"/>
+        <w:gridCol w:w="2880"/>
+        <w:gridCol w:w="2880"/>
+      </w:tblGrid>
+      <w:tr>
+        <w:tc>
+          <w:tcPr>
+            <w:tcW w:type="dxa" w:w="2880"/>
+          </w:tcPr>
+          <w:p>
+            <w:r>
+              <w:rPr>
+                <w:b/>
+              </w:rPr>
+              <w:t>panel</w:t>
+            </w:r>
+          </w:p>
+        </w:tc>
+        <w:tc>
+          <w:tcPr>
+            <w:tcW w:type="dxa" w:w="2880"/>
+          </w:tcPr>
+          <w:p>
+            <w:r>
+              <w:rPr>
+                <w:b/>
+              </w:rPr>
+              <w:t>what it checks</w:t>
+            </w:r>
+          </w:p>
+        </w:tc>
+        <w:tc>
+          <w:tcPr>
+            <w:tcW w:type="dxa" w:w="2880"/>
+          </w:tcPr>
+          <w:p>
+            <w:r>
+              <w:rPr>
+                <w:b/>
+              </w:rPr>
+              <w:t>result — still sane?</w:t>
+            </w:r>
+          </w:p>
+        </w:tc>
+      </w:tr>
+      <w:tr>
+        <w:tc>
+          <w:tcPr>
+            <w:tcW w:type="dxa" w:w="2880"/>
+          </w:tcPr>
+          <w:p>
+            <w:r>
+              <w:t>V1</w:t>
+            </w:r>
+          </w:p>
+        </w:tc>
+        <w:tc>
+          <w:tcPr>
+            <w:tcW w:type="dxa" w:w="2880"/>
+          </w:tcPr>
+          <w:p>
+            <w:r>
+              <w:t>dendritic input-output vs. dendritic inhibition</w:t>
+            </w:r>
+          </w:p>
+        </w:tc>
+        <w:tc>
+          <w:tcPr>
+            <w:tcW w:type="dxa" w:w="2880"/>
+          </w:tcPr>
+          <w:p>
+            <w:r>
+              <w:t>Yes. Half-activation conductance rises monotonically with inhibition (22 -&gt; 217 nS as inh goes 0 -&gt; 35 nS); V at a fixed 25 nS drive drops from -31 mV (no inh) to -69 mV (35 nS) — inhibition shifts the dendritic threshold rightward, as expected.</w:t>
+            </w:r>
+          </w:p>
+        </w:tc>
+      </w:tr>
+      <w:tr>
+        <w:tc>
+          <w:tcPr>
+            <w:tcW w:type="dxa" w:w="2880"/>
+          </w:tcPr>
+          <w:p>
+            <w:r>
+              <w:t>V2</w:t>
+            </w:r>
+          </w:p>
+        </w:tc>
+        <w:tc>
+          <w:tcPr>
+            <w:tcW w:type="dxa" w:w="2880"/>
+          </w:tcPr>
+          <w:p>
+            <w:r>
+              <w:t>LTP (final rho) vs. presynaptic rate, free vs. inhibited branch</w:t>
+            </w:r>
+          </w:p>
+        </w:tc>
+        <w:tc>
+          <w:tcPr>
+            <w:tcW w:type="dxa" w:w="2880"/>
+          </w:tcPr>
+          <w:p>
+            <w:r>
+              <w:t>Yes. Free-branch rho rises with rate (0.88 -&gt; 0.93 over 20-120 Hz) while the inhibited branch stays suppressed (0.46 -&gt; ~0.16); the free/inhibited gap widens with rate.</w:t>
+            </w:r>
+          </w:p>
+        </w:tc>
+      </w:tr>
+      <w:tr>
+        <w:tc>
+          <w:tcPr>
+            <w:tcW w:type="dxa" w:w="2880"/>
+          </w:tcPr>
+          <w:p>
+            <w:r>
+              <w:t>V3</w:t>
+            </w:r>
+          </w:p>
+        </w:tc>
+        <w:tc>
+          <w:tcPr>
+            <w:tcW w:type="dxa" w:w="2880"/>
+          </w:tcPr>
+          <w:p>
+            <w:r>
+              <w:t>branch-specific gating ratio at 80 Hz exc / 10 Hz post</w:t>
+            </w:r>
+          </w:p>
+        </w:tc>
+        <w:tc>
+          <w:tcPr>
+            <w:tcW w:type="dxa" w:w="2880"/>
+          </w:tcPr>
+          <w:p>
+            <w:r>
+              <w:t>Yes. free 0.925, inhibited 0.168, ratio 5.50 — independently reproduces the Phase-1 headline (5.58, Section 8.2) to ~1.5%.</w:t>
+            </w:r>
+          </w:p>
+        </w:tc>
+      </w:tr>
+      <w:tr>
+        <w:tc>
+          <w:tcPr>
+            <w:tcW w:type="dxa" w:w="2880"/>
+          </w:tcPr>
+          <w:p>
+            <w:r>
+              <w:t>V4</w:t>
+            </w:r>
+          </w:p>
+        </w:tc>
+        <w:tc>
+          <w:tcPr>
+            <w:tcW w:type="dxa" w:w="2880"/>
+          </w:tcPr>
+          <w:p>
+            <w:r>
+              <w:t>MD-driven interneuron recruitment</w:t>
+            </w:r>
+          </w:p>
+        </w:tc>
+        <w:tc>
+          <w:tcPr>
+            <w:tcW w:type="dxa" w:w="2880"/>
+          </w:tcPr>
+          <w:p>
+            <w:r>
+              <w:t>Yes. As MD rate goes 0 -&gt; 40 Hz, PV climbs (6.5 -&gt; 119 Hz) and VIP climbs (0 -&gt; 86 Hz) while VIP-driven SOM is suppressed (24.7 -&gt; 0 Hz) and pyramidal output falls (18 -&gt; 0 Hz) — the disinhibitory motif behaves as designed.</w:t>
+            </w:r>
+          </w:p>
+        </w:tc>
+      </w:tr>
+    </w:tbl>
+    <w:p/>
+    <w:p>
+      <w:pPr>
+        <w:jc w:val="center"/>
+      </w:pPr>
+      <w:r>
+        <w:drawing>
+          <wp:inline xmlns:a="http://schemas.openxmlformats.org/drawingml/2006/main" xmlns:pic="http://schemas.openxmlformats.org/drawingml/2006/picture">
+            <wp:extent cx="5486400" cy="5486400"/>
+            <wp:docPr id="16" name="Picture 16"/>
+            <wp:cNvGraphicFramePr>
+              <a:graphicFrameLocks noChangeAspect="1"/>
+            </wp:cNvGraphicFramePr>
+            <a:graphic>
+              <a:graphicData uri="http://schemas.openxmlformats.org/drawingml/2006/picture">
+                <pic:pic>
+                  <pic:nvPicPr>
+                    <pic:cNvPr id="0" name="v3_branch_gating.png"/>
+                    <pic:cNvPicPr/>
+                  </pic:nvPicPr>
+                  <pic:blipFill>
+                    <a:blip r:embed="rId22"/>
+                    <a:stretch>
+                      <a:fillRect/>
+                    </a:stretch>
+                  </pic:blipFill>
+                  <pic:spPr>
+                    <a:xfrm>
+                      <a:off x="0" y="0"/>
+                      <a:ext cx="5486400" cy="5486400"/>
+                    </a:xfrm>
+                    <a:prstGeom prst="rect"/>
+                  </pic:spPr>
+                </pic:pic>
+              </a:graphicData>
+            </a:graphic>
+          </wp:inline>
+        </w:drawing>
+      </w:r>
+    </w:p>
+    <w:p>
+      <w:pPr>
+        <w:jc w:val="center"/>
+      </w:pPr>
+      <w:r>
+        <w:rPr>
+          <w:i/>
+          <w:sz w:val="18"/>
+        </w:rPr>
+        <w:t>Figure 16. Validation panel V3: branch-specific gating under the committed calibration reproduces the Phase-1 headline ratio (5.50) via an independent code path.</w:t>
+      </w:r>
+    </w:p>
+    <w:p>
+      <w:r>
+        <w:rPr>
+          <w:b w:val="0"/>
+          <w:i w:val="0"/>
+        </w:rPr>
+        <w:t>Nothing in the battery contradicts the 25 Hz recalibration; the recalibration changed the operating point, not the qualitative physiology. The one honest reservation carried forward from Section 7 is unchanged: these are all self-consistency and directional checks against the paper's *reported behaviours*, not a fit to the paper's raw data, and the network-scale replication (Yang's ~3,000-neuron network) still hasn't been started (Section 6 open item).</w:t>
+      </w:r>
+    </w:p>
+    <w:p>
+      <w:pPr>
+        <w:pStyle w:val="Heading2"/>
+      </w:pPr>
+      <w:r>
+        <w:t>8.5 Where this leaves things</w:t>
+      </w:r>
+    </w:p>
+    <w:p>
+      <w:r>
+        <w:rPr>
+          <w:b w:val="0"/>
+          <w:i w:val="0"/>
+        </w:rPr>
+        <w:t>The Section 7.3 decision is now committed in code (25 Hz SOM, with the caveats above), the Phase-1 headline ratio is stable at ~5.6 across three code paths for the first time, and both Phase 2 sweeps plus the paper battery have been rerun honestly under the analytical update — clearing the debt Section 7.2 opened. The recurring structural result across every Phase-2 knob is that gating passes or fails at a single place: whether SOM stays above the ~20 Hz duty-cycle threshold. The open items that remain are the ones this entry did not touch: the non-portability of iBaseline_som into full_circuit.py (needs its own rate measurement), the undiagnosed zero-noise variance in Phase 2B, Test 5's seed-reproducibility failure (Section 7), and the un-started network-scale stage.</w:t>
+      </w:r>
+    </w:p>
     <w:sectPr>
       <w:pgSz w:w="12240" w:h="15840"/>
       <w:pgMar w:top="1440" w:right="1800" w:bottom="1440" w:left="1800" w:header="720" w:footer="720" w:gutter="0"/>

</xml_diff>

<commit_message>
SOM baseline locked to 30 Hz via full-circuit reliability sweep (seeds 40-59); reduced-circuit sweep retired as evidence; Phase 2 re-validated
Co-Authored-By: Claude Sonnet 5 <noreply@anthropic.com>
</commit_message>
<xml_diff>
--- a/docs/Progress_Report.docx
+++ b/docs/Progress_Report.docx
@@ -5758,6 +5758,825 @@
         <w:t>The Section 7.3 decision is now committed in code (25 Hz SOM, with the caveats above), the Phase-1 headline ratio is stable at ~5.6 across three code paths for the first time, and both Phase 2 sweeps plus the paper battery have been rerun honestly under the analytical update — clearing the debt Section 7.2 opened. The recurring structural result across every Phase-2 knob is that gating passes or fails at a single place: whether SOM stays above the ~20 Hz duty-cycle threshold. The open items that remain are the ones this entry did not touch: the non-portability of iBaseline_som into full_circuit.py (needs its own rate measurement), the undiagnosed zero-noise variance in Phase 2B, Test 5's seed-reproducibility failure (Section 7), and the un-started network-scale stage.</w:t>
       </w:r>
     </w:p>
+    <w:p>
+      <w:pPr>
+        <w:pStyle w:val="Heading1"/>
+      </w:pPr>
+      <w:r>
+        <w:t>9. 2026-09-02 update — SOM baseline relocked to 30 Hz via a full-circuit reliability sweep</w:t>
+      </w:r>
+    </w:p>
+    <w:p>
+      <w:pPr>
+        <w:pStyle w:val="Heading2"/>
+      </w:pPr>
+      <w:r>
+        <w:t>9.1 The reduced-vs-full circuit mismatch, and a new evidence rule</w:t>
+      </w:r>
+    </w:p>
+    <w:p>
+      <w:r>
+        <w:rPr>
+          <w:b w:val="0"/>
+          <w:i w:val="0"/>
+        </w:rPr>
+        <w:t>Section 8's reliability claims — Test 5's seed-44 failure and the ~1.5% cross-code-path stability figure — were both measured in the reduced Phase-1 circuit (phase1_single_neuron_gating.py / phase1_reliability_sweep.py), not in model/full_circuit.py, which is the circuit every Phase 2 result and every number in this report actually comes from. Section 4.2 had already flagged that the same iBaseline_som pA value produces a different SOM rate in the two circuits (25 pA measured 63.3 Hz reduced vs. ~36-40 Hz full); the reliability story inherited the same disjunction without it being named as a problem. Going forward, the rule is: any reliability or validation number cited in this report or to the PI must come from the full circuit. The reduced circuit remains useful for fast dev iteration but is retired as evidence (a note to that effect is now in phase1_reliability_sweep.py's docstring); experiments/full_circuit_reliability_sweep.py is the new script for anything citable.</w:t>
+      </w:r>
+    </w:p>
+    <w:p>
+      <w:pPr>
+        <w:pStyle w:val="Heading2"/>
+      </w:pPr>
+      <w:r>
+        <w:t>9.2 Reproducing the seed-44 failure in the full circuit</w:t>
+      </w:r>
+    </w:p>
+    <w:p>
+      <w:r>
+        <w:rPr>
+          <w:b w:val="0"/>
+          <w:i w:val="0"/>
+        </w:rPr>
+        <w:t>Before trusting any new full-circuit sweep, the specific failure that started this — Test 5's seed 44 collapsing to ratio ~1.015 — needed to reproduce in the circuit that matters. diag_seed44.py reran seeds 42-46 in model/full_circuit.py at noise_level=0, 10 analytical-plasticity epochs each, same protocol as the sweeps below.</w:t>
+      </w:r>
+    </w:p>
+    <w:tbl>
+      <w:tblPr>
+        <w:tblStyle w:val="LightGrid-Accent1"/>
+        <w:tblW w:type="auto" w:w="0"/>
+        <w:tblLook w:firstColumn="1" w:firstRow="1" w:lastColumn="0" w:lastRow="0" w:noHBand="0" w:noVBand="1" w:val="04A0"/>
+      </w:tblPr>
+      <w:tblGrid>
+        <w:gridCol w:w="1440"/>
+        <w:gridCol w:w="1440"/>
+        <w:gridCol w:w="1440"/>
+        <w:gridCol w:w="1440"/>
+        <w:gridCol w:w="1440"/>
+        <w:gridCol w:w="1440"/>
+      </w:tblGrid>
+      <w:tr>
+        <w:tc>
+          <w:tcPr>
+            <w:tcW w:type="dxa" w:w="1440"/>
+          </w:tcPr>
+          <w:p>
+            <w:r>
+              <w:rPr>
+                <w:b/>
+              </w:rPr>
+              <w:t>seed</w:t>
+            </w:r>
+          </w:p>
+        </w:tc>
+        <w:tc>
+          <w:tcPr>
+            <w:tcW w:type="dxa" w:w="1440"/>
+          </w:tcPr>
+          <w:p>
+            <w:r>
+              <w:rPr>
+                <w:b/>
+              </w:rPr>
+              <w:t>42</w:t>
+            </w:r>
+          </w:p>
+        </w:tc>
+        <w:tc>
+          <w:tcPr>
+            <w:tcW w:type="dxa" w:w="1440"/>
+          </w:tcPr>
+          <w:p>
+            <w:r>
+              <w:rPr>
+                <w:b/>
+              </w:rPr>
+              <w:t>43</w:t>
+            </w:r>
+          </w:p>
+        </w:tc>
+        <w:tc>
+          <w:tcPr>
+            <w:tcW w:type="dxa" w:w="1440"/>
+          </w:tcPr>
+          <w:p>
+            <w:r>
+              <w:rPr>
+                <w:b/>
+              </w:rPr>
+              <w:t>44</w:t>
+            </w:r>
+          </w:p>
+        </w:tc>
+        <w:tc>
+          <w:tcPr>
+            <w:tcW w:type="dxa" w:w="1440"/>
+          </w:tcPr>
+          <w:p>
+            <w:r>
+              <w:rPr>
+                <w:b/>
+              </w:rPr>
+              <w:t>45</w:t>
+            </w:r>
+          </w:p>
+        </w:tc>
+        <w:tc>
+          <w:tcPr>
+            <w:tcW w:type="dxa" w:w="1440"/>
+          </w:tcPr>
+          <w:p>
+            <w:r>
+              <w:rPr>
+                <w:b/>
+              </w:rPr>
+              <w:t>46</w:t>
+            </w:r>
+          </w:p>
+        </w:tc>
+      </w:tr>
+      <w:tr>
+        <w:tc>
+          <w:tcPr>
+            <w:tcW w:type="dxa" w:w="1440"/>
+          </w:tcPr>
+          <w:p>
+            <w:r>
+              <w:t>gating ratio</w:t>
+            </w:r>
+          </w:p>
+        </w:tc>
+        <w:tc>
+          <w:tcPr>
+            <w:tcW w:type="dxa" w:w="1440"/>
+          </w:tcPr>
+          <w:p>
+            <w:r>
+              <w:t>4.068</w:t>
+            </w:r>
+          </w:p>
+        </w:tc>
+        <w:tc>
+          <w:tcPr>
+            <w:tcW w:type="dxa" w:w="1440"/>
+          </w:tcPr>
+          <w:p>
+            <w:r>
+              <w:t>4.808</w:t>
+            </w:r>
+          </w:p>
+        </w:tc>
+        <w:tc>
+          <w:tcPr>
+            <w:tcW w:type="dxa" w:w="1440"/>
+          </w:tcPr>
+          <w:p>
+            <w:r>
+              <w:t>1.015</w:t>
+            </w:r>
+          </w:p>
+        </w:tc>
+        <w:tc>
+          <w:tcPr>
+            <w:tcW w:type="dxa" w:w="1440"/>
+          </w:tcPr>
+          <w:p>
+            <w:r>
+              <w:t>4.816</w:t>
+            </w:r>
+          </w:p>
+        </w:tc>
+        <w:tc>
+          <w:tcPr>
+            <w:tcW w:type="dxa" w:w="1440"/>
+          </w:tcPr>
+          <w:p>
+            <w:r>
+              <w:t>4.381</w:t>
+            </w:r>
+          </w:p>
+        </w:tc>
+      </w:tr>
+      <w:tr>
+        <w:tc>
+          <w:tcPr>
+            <w:tcW w:type="dxa" w:w="1440"/>
+          </w:tcPr>
+          <w:p>
+            <w:r>
+              <w:t>result</w:t>
+            </w:r>
+          </w:p>
+        </w:tc>
+        <w:tc>
+          <w:tcPr>
+            <w:tcW w:type="dxa" w:w="1440"/>
+          </w:tcPr>
+          <w:p>
+            <w:r>
+              <w:t>PASS</w:t>
+            </w:r>
+          </w:p>
+        </w:tc>
+        <w:tc>
+          <w:tcPr>
+            <w:tcW w:type="dxa" w:w="1440"/>
+          </w:tcPr>
+          <w:p>
+            <w:r>
+              <w:t>PASS</w:t>
+            </w:r>
+          </w:p>
+        </w:tc>
+        <w:tc>
+          <w:tcPr>
+            <w:tcW w:type="dxa" w:w="1440"/>
+          </w:tcPr>
+          <w:p>
+            <w:r>
+              <w:t>FAIL</w:t>
+            </w:r>
+          </w:p>
+        </w:tc>
+        <w:tc>
+          <w:tcPr>
+            <w:tcW w:type="dxa" w:w="1440"/>
+          </w:tcPr>
+          <w:p>
+            <w:r>
+              <w:t>PASS</w:t>
+            </w:r>
+          </w:p>
+        </w:tc>
+        <w:tc>
+          <w:tcPr>
+            <w:tcW w:type="dxa" w:w="1440"/>
+          </w:tcPr>
+          <w:p>
+            <w:r>
+              <w:t>PASS</w:t>
+            </w:r>
+          </w:p>
+        </w:tc>
+      </w:tr>
+    </w:tbl>
+    <w:p/>
+    <w:p>
+      <w:r>
+        <w:rPr>
+          <w:b w:val="0"/>
+          <w:i w:val="0"/>
+        </w:rPr>
+        <w:t>Seed 44 failed again, at 1.0153 — essentially identical to the original 1.015 — confirming this is a real, reproducible failure rather than a one-off fluke or a Test-5 harness artifact. The failure signature is informative: the inhibited branch's rate (r0) climbed to 0.9105, matching the free branch (r1=0.9245) almost exactly — SOM lost control of the inhibited branch entirely rather than the ratio merely softening. This is the same qualitative picture as the noise-driven and MD-&gt;VIP-driven collapses in Section 8.3: once SOM's effective rate falls through the duty-cycle threshold, the branch it was gating escapes rather than partially leaking.</w:t>
+      </w:r>
+    </w:p>
+    <w:p>
+      <w:pPr>
+        <w:pStyle w:val="Heading2"/>
+      </w:pPr>
+      <w:r>
+        <w:t>9.3 A 20-seed full-circuit reliability sweep, and the rate decision</w:t>
+      </w:r>
+    </w:p>
+    <w:p>
+      <w:r>
+        <w:rPr>
+          <w:b w:val="0"/>
+          <w:i w:val="0"/>
+        </w:rPr>
+        <w:t>With the failure confirmed in the right circuit, the actual reliability question — does 25 Hz hold up broadly, and if not what does — was answered with a 20-seed sweep (seeds 40-59, noise_level=0, full circuit) at each candidate rate, parallelized across 8 worker processes (experiments/full_circuit_reliability_sweep.py; Brian2's numpy codegen target has no shared compile cache, so this parallelizes safely). 30 Hz (21.32 pA) passed cleanly:</w:t>
+      </w:r>
+    </w:p>
+    <w:tbl>
+      <w:tblPr>
+        <w:tblStyle w:val="LightGrid-Accent1"/>
+        <w:tblW w:type="auto" w:w="0"/>
+        <w:tblLook w:firstColumn="1" w:firstRow="1" w:lastColumn="0" w:lastRow="0" w:noHBand="0" w:noVBand="1" w:val="04A0"/>
+      </w:tblPr>
+      <w:tblGrid>
+        <w:gridCol w:w="2160"/>
+        <w:gridCol w:w="2160"/>
+        <w:gridCol w:w="2160"/>
+        <w:gridCol w:w="2160"/>
+      </w:tblGrid>
+      <w:tr>
+        <w:tc>
+          <w:tcPr>
+            <w:tcW w:type="dxa" w:w="2160"/>
+          </w:tcPr>
+          <w:p>
+            <w:r>
+              <w:rPr>
+                <w:b/>
+              </w:rPr>
+              <w:t>rate</w:t>
+            </w:r>
+          </w:p>
+        </w:tc>
+        <w:tc>
+          <w:tcPr>
+            <w:tcW w:type="dxa" w:w="2160"/>
+          </w:tcPr>
+          <w:p>
+            <w:r>
+              <w:rPr>
+                <w:b/>
+              </w:rPr>
+              <w:t>seeds tested</w:t>
+            </w:r>
+          </w:p>
+        </w:tc>
+        <w:tc>
+          <w:tcPr>
+            <w:tcW w:type="dxa" w:w="2160"/>
+          </w:tcPr>
+          <w:p>
+            <w:r>
+              <w:rPr>
+                <w:b/>
+              </w:rPr>
+              <w:t>passed (ratio&gt;2.0)</w:t>
+            </w:r>
+          </w:p>
+        </w:tc>
+        <w:tc>
+          <w:tcPr>
+            <w:tcW w:type="dxa" w:w="2160"/>
+          </w:tcPr>
+          <w:p>
+            <w:r>
+              <w:rPr>
+                <w:b/>
+              </w:rPr>
+              <w:t>ratio range</w:t>
+            </w:r>
+          </w:p>
+        </w:tc>
+      </w:tr>
+      <w:tr>
+        <w:tc>
+          <w:tcPr>
+            <w:tcW w:type="dxa" w:w="2160"/>
+          </w:tcPr>
+          <w:p>
+            <w:r>
+              <w:t>25 Hz (20.90 pA)</w:t>
+            </w:r>
+          </w:p>
+        </w:tc>
+        <w:tc>
+          <w:tcPr>
+            <w:tcW w:type="dxa" w:w="2160"/>
+          </w:tcPr>
+          <w:p>
+            <w:r>
+              <w:t>1 (seed 44, historical)</w:t>
+            </w:r>
+          </w:p>
+        </w:tc>
+        <w:tc>
+          <w:tcPr>
+            <w:tcW w:type="dxa" w:w="2160"/>
+          </w:tcPr>
+          <w:p>
+            <w:r>
+              <w:t>0/1 — reproduced above</w:t>
+            </w:r>
+          </w:p>
+        </w:tc>
+        <w:tc>
+          <w:tcPr>
+            <w:tcW w:type="dxa" w:w="2160"/>
+          </w:tcPr>
+          <w:p>
+            <w:r>
+              <w:t>1.015</w:t>
+            </w:r>
+          </w:p>
+        </w:tc>
+      </w:tr>
+      <w:tr>
+        <w:tc>
+          <w:tcPr>
+            <w:tcW w:type="dxa" w:w="2160"/>
+          </w:tcPr>
+          <w:p>
+            <w:r>
+              <w:t>30 Hz (21.32 pA)</w:t>
+            </w:r>
+          </w:p>
+        </w:tc>
+        <w:tc>
+          <w:tcPr>
+            <w:tcW w:type="dxa" w:w="2160"/>
+          </w:tcPr>
+          <w:p>
+            <w:r>
+              <w:t>40-59 (20 seeds)</w:t>
+            </w:r>
+          </w:p>
+        </w:tc>
+        <w:tc>
+          <w:tcPr>
+            <w:tcW w:type="dxa" w:w="2160"/>
+          </w:tcPr>
+          <w:p>
+            <w:r>
+              <w:t>20/20</w:t>
+            </w:r>
+          </w:p>
+        </w:tc>
+        <w:tc>
+          <w:tcPr>
+            <w:tcW w:type="dxa" w:w="2160"/>
+          </w:tcPr>
+          <w:p>
+            <w:r>
+              <w:t>3.25 - 5.07</w:t>
+            </w:r>
+          </w:p>
+        </w:tc>
+      </w:tr>
+    </w:tbl>
+    <w:p/>
+    <w:p>
+      <w:r>
+        <w:rPr>
+          <w:b w:val="0"/>
+          <w:i w:val="0"/>
+        </w:rPr>
+        <w:t>All 20 seeds passed at 30 Hz, so the 33 Hz fallback was never needed. The margin above the ~21 Hz duty-cycle cliff identified in Section 7.3/8.1 is now ~9 Hz, versus the ~4 Hz margin 25 Hz carried — seed 44's failure is exactly the kind of near-cliff outlier a 4 Hz margin should be expected to produce occasionally. iBaseline_som is now 21.32 pA in model/parameters.py (with the reasoning above appended as a comment), synchronized across the three other hardcoded defaults (model/full_circuit.py, experiments/phase1_analytical.py, experiments/validate_vs_papers.py) that don't read parameters.py.</w:t>
+      </w:r>
+    </w:p>
+    <w:p>
+      <w:r>
+        <w:rPr>
+          <w:b/>
+          <w:color w:val="B00000"/>
+        </w:rPr>
+        <w:t xml:space="preserve">Flag: </w:t>
+      </w:r>
+      <w:r>
+        <w:rPr>
+          <w:i/>
+        </w:rPr>
+        <w:t>This changes the calibration but not the underlying mechanism: 30 Hz is still motivated by the same duty-cycle argument as 25 Hz (tau_GABA,dend=20 ms coverage of the inter-spike interval), just with a wider safety margin — 3x Yang's 10 Hz baseline rather than 2.5x, defensible on the same biophysical grounds.</w:t>
+      </w:r>
+    </w:p>
+    <w:p>
+      <w:pPr>
+        <w:pStyle w:val="Heading2"/>
+      </w:pPr>
+      <w:r>
+        <w:t>9.4 Phase 2 re-validated at the new baseline — breaking points held, baseline got tighter</w:t>
+      </w:r>
+    </w:p>
+    <w:p>
+      <w:r>
+        <w:rPr>
+          <w:b w:val="0"/>
+          <w:i w:val="0"/>
+        </w:rPr>
+        <w:t>Both Phase 2 sweeps were rerun in full at 30 Hz. The 25 Hz-era results were archived (docs/*_at25hz.json, figures/*_at25hz.png) before rerunning so the comparison below is against the actual prior numbers, not a description of them.</w:t>
+      </w:r>
+    </w:p>
+    <w:tbl>
+      <w:tblPr>
+        <w:tblStyle w:val="LightGrid-Accent1"/>
+        <w:tblW w:type="auto" w:w="0"/>
+        <w:tblLook w:firstColumn="1" w:firstRow="1" w:lastColumn="0" w:lastRow="0" w:noHBand="0" w:noVBand="1" w:val="04A0"/>
+      </w:tblPr>
+      <w:tblGrid>
+        <w:gridCol w:w="1080"/>
+        <w:gridCol w:w="1080"/>
+        <w:gridCol w:w="1080"/>
+        <w:gridCol w:w="1080"/>
+        <w:gridCol w:w="1080"/>
+        <w:gridCol w:w="1080"/>
+        <w:gridCol w:w="1080"/>
+        <w:gridCol w:w="1080"/>
+      </w:tblGrid>
+      <w:tr>
+        <w:tc>
+          <w:tcPr>
+            <w:tcW w:type="dxa" w:w="1080"/>
+          </w:tcPr>
+          <w:p>
+            <w:r>
+              <w:rPr>
+                <w:b/>
+              </w:rPr>
+              <w:t>noise level</w:t>
+            </w:r>
+          </w:p>
+        </w:tc>
+        <w:tc>
+          <w:tcPr>
+            <w:tcW w:type="dxa" w:w="1080"/>
+          </w:tcPr>
+          <w:p>
+            <w:r>
+              <w:rPr>
+                <w:b/>
+              </w:rPr>
+              <w:t>0.0</w:t>
+            </w:r>
+          </w:p>
+        </w:tc>
+        <w:tc>
+          <w:tcPr>
+            <w:tcW w:type="dxa" w:w="1080"/>
+          </w:tcPr>
+          <w:p>
+            <w:r>
+              <w:rPr>
+                <w:b/>
+              </w:rPr>
+              <w:t>0.25</w:t>
+            </w:r>
+          </w:p>
+        </w:tc>
+        <w:tc>
+          <w:tcPr>
+            <w:tcW w:type="dxa" w:w="1080"/>
+          </w:tcPr>
+          <w:p>
+            <w:r>
+              <w:rPr>
+                <w:b/>
+              </w:rPr>
+              <w:t>0.30</w:t>
+            </w:r>
+          </w:p>
+        </w:tc>
+        <w:tc>
+          <w:tcPr>
+            <w:tcW w:type="dxa" w:w="1080"/>
+          </w:tcPr>
+          <w:p>
+            <w:r>
+              <w:rPr>
+                <w:b/>
+              </w:rPr>
+              <w:t>0.35</w:t>
+            </w:r>
+          </w:p>
+        </w:tc>
+        <w:tc>
+          <w:tcPr>
+            <w:tcW w:type="dxa" w:w="1080"/>
+          </w:tcPr>
+          <w:p>
+            <w:r>
+              <w:rPr>
+                <w:b/>
+              </w:rPr>
+              <w:t>0.40</w:t>
+            </w:r>
+          </w:p>
+        </w:tc>
+        <w:tc>
+          <w:tcPr>
+            <w:tcW w:type="dxa" w:w="1080"/>
+          </w:tcPr>
+          <w:p>
+            <w:r>
+              <w:rPr>
+                <w:b/>
+              </w:rPr>
+              <w:t>0.45</w:t>
+            </w:r>
+          </w:p>
+        </w:tc>
+        <w:tc>
+          <w:tcPr>
+            <w:tcW w:type="dxa" w:w="1080"/>
+          </w:tcPr>
+          <w:p>
+            <w:r>
+              <w:rPr>
+                <w:b/>
+              </w:rPr>
+              <w:t>&gt;=0.50</w:t>
+            </w:r>
+          </w:p>
+        </w:tc>
+      </w:tr>
+      <w:tr>
+        <w:tc>
+          <w:tcPr>
+            <w:tcW w:type="dxa" w:w="1080"/>
+          </w:tcPr>
+          <w:p>
+            <w:r>
+              <w:t>ratio @ 25 Hz (archived)</w:t>
+            </w:r>
+          </w:p>
+        </w:tc>
+        <w:tc>
+          <w:tcPr>
+            <w:tcW w:type="dxa" w:w="1080"/>
+          </w:tcPr>
+          <w:p>
+            <w:r>
+              <w:t>3.30</w:t>
+            </w:r>
+          </w:p>
+        </w:tc>
+        <w:tc>
+          <w:tcPr>
+            <w:tcW w:type="dxa" w:w="1080"/>
+          </w:tcPr>
+          <w:p>
+            <w:r>
+              <w:t>2.77</w:t>
+            </w:r>
+          </w:p>
+        </w:tc>
+        <w:tc>
+          <w:tcPr>
+            <w:tcW w:type="dxa" w:w="1080"/>
+          </w:tcPr>
+          <w:p>
+            <w:r>
+              <w:t>2.30</w:t>
+            </w:r>
+          </w:p>
+        </w:tc>
+        <w:tc>
+          <w:tcPr>
+            <w:tcW w:type="dxa" w:w="1080"/>
+          </w:tcPr>
+          <w:p>
+            <w:r>
+              <w:t>1.73</w:t>
+            </w:r>
+          </w:p>
+        </w:tc>
+        <w:tc>
+          <w:tcPr>
+            <w:tcW w:type="dxa" w:w="1080"/>
+          </w:tcPr>
+          <w:p>
+            <w:r>
+              <w:t>1.10</w:t>
+            </w:r>
+          </w:p>
+        </w:tc>
+        <w:tc>
+          <w:tcPr>
+            <w:tcW w:type="dxa" w:w="1080"/>
+          </w:tcPr>
+          <w:p>
+            <w:r>
+              <w:t>1.02</w:t>
+            </w:r>
+          </w:p>
+        </w:tc>
+        <w:tc>
+          <w:tcPr>
+            <w:tcW w:type="dxa" w:w="1080"/>
+          </w:tcPr>
+          <w:p>
+            <w:r>
+              <w:t>~1.00</w:t>
+            </w:r>
+          </w:p>
+        </w:tc>
+      </w:tr>
+      <w:tr>
+        <w:tc>
+          <w:tcPr>
+            <w:tcW w:type="dxa" w:w="1080"/>
+          </w:tcPr>
+          <w:p>
+            <w:r>
+              <w:t>ratio @ 30 Hz (new)</w:t>
+            </w:r>
+          </w:p>
+        </w:tc>
+        <w:tc>
+          <w:tcPr>
+            <w:tcW w:type="dxa" w:w="1080"/>
+          </w:tcPr>
+          <w:p>
+            <w:r>
+              <w:t>4.18</w:t>
+            </w:r>
+          </w:p>
+        </w:tc>
+        <w:tc>
+          <w:tcPr>
+            <w:tcW w:type="dxa" w:w="1080"/>
+          </w:tcPr>
+          <w:p>
+            <w:r>
+              <w:t>2.76</w:t>
+            </w:r>
+          </w:p>
+        </w:tc>
+        <w:tc>
+          <w:tcPr>
+            <w:tcW w:type="dxa" w:w="1080"/>
+          </w:tcPr>
+          <w:p>
+            <w:r>
+              <w:t>2.31</w:t>
+            </w:r>
+          </w:p>
+        </w:tc>
+        <w:tc>
+          <w:tcPr>
+            <w:tcW w:type="dxa" w:w="1080"/>
+          </w:tcPr>
+          <w:p>
+            <w:r>
+              <w:t>1.82</w:t>
+            </w:r>
+          </w:p>
+        </w:tc>
+        <w:tc>
+          <w:tcPr>
+            <w:tcW w:type="dxa" w:w="1080"/>
+          </w:tcPr>
+          <w:p>
+            <w:r>
+              <w:t>1.12</w:t>
+            </w:r>
+          </w:p>
+        </w:tc>
+        <w:tc>
+          <w:tcPr>
+            <w:tcW w:type="dxa" w:w="1080"/>
+          </w:tcPr>
+          <w:p>
+            <w:r>
+              <w:t>1.02</w:t>
+            </w:r>
+          </w:p>
+        </w:tc>
+        <w:tc>
+          <w:tcPr>
+            <w:tcW w:type="dxa" w:w="1080"/>
+          </w:tcPr>
+          <w:p>
+            <w:r>
+              <w:t>~1.00</w:t>
+            </w:r>
+          </w:p>
+        </w:tc>
+      </w:tr>
+    </w:tbl>
+    <w:p/>
+    <w:p>
+      <w:r>
+        <w:rPr>
+          <w:b w:val="0"/>
+          <w:i w:val="0"/>
+        </w:rPr>
+        <w:t>The Phase 2B collapse point is unchanged: ratio holds above 2 through noise 0.30, is marginal at 0.35, and has collapsed by 0.40 in both datasets. The one real difference is the noise=0 baseline itself, which is both higher and far tighter across seeds (3.30 +/- 1.16 -&gt; 4.18 +/- 0.52 SEM) — a direct, welcome side effect of moving away from 25 Hz's thin margin. That zero-noise variance was flagged as undiagnosed in Section 8.3a; it has not been root-caused, but it has shrunk substantially now that the baseline sits further from the cliff.</w:t>
+      </w:r>
+    </w:p>
+    <w:p>
+      <w:r>
+        <w:rPr>
+          <w:b w:val="0"/>
+          <w:i w:val="0"/>
+        </w:rPr>
+        <w:t>Phase 2C (the MD-&gt;VIP / schizophrenia-analogue sweep) shows the same pattern: intact MD-&gt;VIP drive (scale 1.0) and scale 0.66 are both fully collapsed (ratio ~1.00, SOM silenced) at either baseline — the transition still sits between scale 0.66 and 0.33. The healthy end is again higher at 30 Hz (scale 0.33: 3.29 -&gt; 4.18; full block: 3.42 -&gt; 4.16), consistent with the same baseline shift seen in Phase 2B.</w:t>
+      </w:r>
+    </w:p>
+    <w:p>
+      <w:r>
+        <w:rPr>
+          <w:b/>
+          <w:color w:val="B00000"/>
+        </w:rPr>
+        <w:t xml:space="preserve">Flag: </w:t>
+      </w:r>
+      <w:r>
+        <w:rPr>
+          <w:i/>
+        </w:rPr>
+        <w:t>Both breaking points held their qualitative shape and approximate location — this was a recalibration of the SOM baseline's safety margin, not a change to the gating mechanism or its failure modes. The regenerated figures (figures/phase2_snr_curve.png, figures/phase2_ketamine_failure.png) now show the 30 Hz data; the 25 Hz-era versions are preserved as figures/phase2_snr_curve_at25hz.png and figures/phase2_ketamine_failure_at25hz.png for reference.</w:t>
+      </w:r>
+    </w:p>
+    <w:p>
+      <w:pPr>
+        <w:pStyle w:val="Heading2"/>
+      </w:pPr>
+      <w:r>
+        <w:t>9.5 Where this leaves things</w:t>
+      </w:r>
+    </w:p>
+    <w:p>
+      <w:r>
+        <w:rPr>
+          <w:b w:val="0"/>
+          <w:i w:val="0"/>
+        </w:rPr>
+        <w:t>30 Hz / 21.32 pA is locked as the SOM baseline, backed by a 20/20 full-circuit reliability sweep rather than a single seed's sweep peak. The open items carried forward are largely unchanged from Section 8.5: the network-scale stage is still un-started, and the Phase 2B zero-noise variance — while smaller now — is still not root-caused. One item from Section 8.5 is effectively closed: Test 5's seed-reproducibility failure (Section 7) is the same phenomenon as seed 44 here, and is now understood (near-cliff SOM margin) and resolved (wider margin at 30 Hz) rather than an open question.</w:t>
+      </w:r>
+    </w:p>
     <w:sectPr>
       <w:pgSz w:w="12240" w:h="15840"/>
       <w:pgMar w:top="1440" w:right="1800" w:bottom="1440" w:left="1800" w:header="720" w:footer="720" w:gutter="0"/>

</xml_diff>